<commit_message>
docs: place Lucidchart diagrams within weekly report sections
Position diagrams beside their corresponding discussions in Weeks 5-7, fit their size to portrait pages, and remove duplicated enlargement views. Preserve the reviewed document content and native diagram images.
</commit_message>
<xml_diff>
--- a/docs/architecture/minggu6_arsitektur_modular_classdiagram_erd.docx
+++ b/docs/architecture/minggu6_arsitektur_modular_classdiagram_erd.docx
@@ -52,6 +52,9 @@
         <w:gridCol w:w="100"/>
       </w:tblGrid>
       <w:tr>
+        <w:trPr>
+          <w:cantSplit/>
+        </w:trPr>
         <w:tc>
           <w:tcPr>
             <w:tcW w:type="pct" w:w="24%"/>
@@ -128,6 +131,9 @@
         </w:tc>
       </w:tr>
       <w:tr>
+        <w:trPr>
+          <w:cantSplit/>
+        </w:trPr>
         <w:tc>
           <w:tcPr>
             <w:tcW w:type="pct" w:w="24%"/>
@@ -204,6 +210,9 @@
         </w:tc>
       </w:tr>
       <w:tr>
+        <w:trPr>
+          <w:cantSplit/>
+        </w:trPr>
         <w:tc>
           <w:tcPr>
             <w:tcW w:type="pct" w:w="24%"/>
@@ -280,6 +289,9 @@
         </w:tc>
       </w:tr>
       <w:tr>
+        <w:trPr>
+          <w:cantSplit/>
+        </w:trPr>
         <w:tc>
           <w:tcPr>
             <w:tcW w:type="pct" w:w="24%"/>
@@ -356,6 +368,9 @@
         </w:tc>
       </w:tr>
       <w:tr>
+        <w:trPr>
+          <w:cantSplit/>
+        </w:trPr>
         <w:tc>
           <w:tcPr>
             <w:tcW w:type="pct" w:w="24%"/>
@@ -432,6 +447,9 @@
         </w:tc>
       </w:tr>
       <w:tr>
+        <w:trPr>
+          <w:cantSplit/>
+        </w:trPr>
         <w:tc>
           <w:tcPr>
             <w:tcW w:type="pct" w:w="24%"/>
@@ -508,6 +526,9 @@
         </w:tc>
       </w:tr>
       <w:tr>
+        <w:trPr>
+          <w:cantSplit/>
+        </w:trPr>
         <w:tc>
           <w:tcPr>
             <w:tcW w:type="pct" w:w="24%"/>
@@ -591,6 +612,8 @@
     </w:p>
     <w:p>
       <w:pPr>
+        <w:keepNext/>
+        <w:keepLines/>
         <w:spacing w:after="160" w:before="320"/>
       </w:pPr>
       <w:r>
@@ -620,6 +643,8 @@
     </w:p>
     <w:p>
       <w:pPr>
+        <w:keepNext/>
+        <w:keepLines/>
         <w:spacing w:after="160" w:before="320"/>
       </w:pPr>
       <w:r>
@@ -649,42 +674,241 @@
     </w:p>
     <w:p>
       <w:pPr>
-        <w:spacing w:after="160" w:before="80"/>
+        <w:keepNext/>
+        <w:keepLines/>
+        <w:spacing w:after="160" w:before="320"/>
+      </w:pPr>
+      <w:r>
+        <w:rPr>
+          <w:rFonts w:ascii="Calibri" w:cs="Calibri" w:eastAsia="Calibri" w:hAnsi="Calibri"/>
+          <w:b/>
+          <w:bCs/>
+          <w:color w:val="1F3864"/>
+          <w:sz w:val="25"/>
+          <w:szCs w:val="25"/>
+        </w:rPr>
+        <w:t xml:space="preserve">2.1 Pola Komunikasi Antar Modul</w:t>
+      </w:r>
+    </w:p>
+    <w:p>
+      <w:pPr>
+        <w:pStyle w:val="ListParagraph"/>
+        <w:numPr>
+          <w:ilvl w:val="0"/>
+          <w:numId w:val="1"/>
+        </w:numPr>
+        <w:spacing w:after="100"/>
+      </w:pPr>
+      <w:r>
+        <w:rPr>
+          <w:rFonts w:ascii="Calibri" w:cs="Calibri" w:eastAsia="Calibri" w:hAnsi="Calibri"/>
+          <w:sz w:val="21"/>
+          <w:szCs w:val="21"/>
+        </w:rPr>
+        <w:t xml:space="preserve">Frontend ↔ Backend: REST API bertukar JSON melalui HTTPS, dengan token JWT dikirim pada header Authorization: Bearer &lt;token&gt; untuk setiap permintaan yang memerlukan autentikasi.</w:t>
+      </w:r>
+    </w:p>
+    <w:p>
+      <w:pPr>
+        <w:pStyle w:val="ListParagraph"/>
+        <w:numPr>
+          <w:ilvl w:val="0"/>
+          <w:numId w:val="1"/>
+        </w:numPr>
+        <w:spacing w:after="100"/>
+      </w:pPr>
+      <w:r>
+        <w:rPr>
+          <w:rFonts w:ascii="Calibri" w:cs="Calibri" w:eastAsia="Calibri" w:hAnsi="Calibri"/>
+          <w:sz w:val="21"/>
+          <w:szCs w:val="21"/>
+        </w:rPr>
+        <w:t>Modul Pendaftaran mengakses modul Event melalui panggilan sinkron ke fasad EventPublicApi (getEvent, reserveSeat, releaseSeat), tanpa mengimpor EventRepository. Fasad membatasi ketergantungan pada kontrak publik modul sesuai NFR-MOD-01 dan NFR-MOD-02. NFR-MOD-04 secara khusus mengatur komunikasi Event ke Notifikasi melalui Observer.</w:t>
+      </w:r>
+    </w:p>
+    <w:p>
+      <w:pPr>
+        <w:pStyle w:val="ListParagraph"/>
+        <w:numPr>
+          <w:ilvl w:val="0"/>
+          <w:numId w:val="1"/>
+        </w:numPr>
+        <w:spacing w:after="100"/>
+      </w:pPr>
+      <w:r>
+        <w:rPr>
+          <w:rFonts w:ascii="Calibri" w:cs="Calibri" w:eastAsia="Calibri" w:hAnsi="Calibri"/>
+          <w:sz w:val="21"/>
+          <w:szCs w:val="21"/>
+        </w:rPr>
+        <w:t>Modul Event dan Pendaftaran menerbitkan EventApproved dan StudentRegistered melalui EventBus in-process setelah transaksi database berhasil commit. NotificationService mendaftarkan handler onEventApproved dan onStudentRegistered saat aplikasi mulai berjalan. EventApproved hanya diterbitkan saat perubahan diajukan menjadi disetujui, bukan saat penolakan atau penyelesaian (US-EVENT-06, NFR-MOD-04).</w:t>
+      </w:r>
+    </w:p>
+    <w:p>
+      <w:pPr>
+        <w:pStyle w:val="ListParagraph"/>
+        <w:numPr>
+          <w:ilvl w:val="0"/>
+          <w:numId w:val="1"/>
+        </w:numPr>
+        <w:spacing w:after="100"/>
+      </w:pPr>
+      <w:r>
+        <w:rPr>
+          <w:rFonts w:ascii="Calibri" w:cs="Calibri" w:eastAsia="Calibri" w:hAnsi="Calibri"/>
+          <w:sz w:val="21"/>
+          <w:szCs w:val="21"/>
+        </w:rPr>
+        <w:t xml:space="preserve">Seluruh modul mengakses basis data hanya melalui repository miliknya sendiri (Repository Pattern, NFR-MOD-02); tidak ada query langsung dari controller/service ke tabel milik modul lain.</w:t>
+      </w:r>
+    </w:p>
+    <w:p>
+      <w:pPr>
+        <w:pStyle w:val="ListParagraph"/>
+        <w:numPr>
+          <w:ilvl w:val="0"/>
+          <w:numId w:val="1"/>
+        </w:numPr>
+        <w:spacing w:after="100"/>
+      </w:pPr>
+      <w:r>
+        <w:rPr>
+          <w:rFonts w:ascii="Calibri" w:cs="Calibri" w:eastAsia="Calibri" w:hAnsi="Calibri"/>
+          <w:sz w:val="21"/>
+          <w:szCs w:val="21"/>
+        </w:rPr>
+        <w:t xml:space="preserve">Shared Kernel menampung kebutuhan lintas modul yang bersifat infrastruktural (JwtProvider, AuthMiddleware, RoleGuard, TransactionManager) sehingga tidak terjadi duplikasi logika otorisasi di tiap modul.</w:t>
+      </w:r>
+    </w:p>
+    <w:p>
+      <w:pPr>
+        <w:keepNext/>
+        <w:keepLines/>
+        <w:spacing w:after="160" w:before="320"/>
+      </w:pPr>
+      <w:r>
+        <w:rPr>
+          <w:rFonts w:ascii="Calibri" w:cs="Calibri" w:eastAsia="Calibri" w:hAnsi="Calibri"/>
+          <w:b/>
+          <w:bCs/>
+          <w:color w:val="1F3864"/>
+          <w:sz w:val="25"/>
+          <w:szCs w:val="25"/>
+        </w:rPr>
+        <w:t xml:space="preserve">2.2 Keterkaitan dengan Design Pattern</w:t>
+      </w:r>
+    </w:p>
+    <w:p>
+      <w:pPr>
+        <w:pStyle w:val="ListParagraph"/>
+        <w:keepNext/>
+        <w:numPr>
+          <w:ilvl w:val="0"/>
+          <w:numId w:val="1"/>
+        </w:numPr>
+        <w:spacing w:after="100"/>
+      </w:pPr>
+      <w:r>
+        <w:rPr>
+          <w:rFonts w:ascii="Calibri" w:cs="Calibri" w:eastAsia="Calibri" w:hAnsi="Calibri"/>
+          <w:sz w:val="21"/>
+          <w:szCs w:val="21"/>
+        </w:rPr>
+        <w:t>MVC memisahkan tampilan React (View), penanganan request/aksi (Controller), dan logika serta data domain (Model). Backend REST memakai route → controller → service → repository. Route memetakan URL dan middleware, bukan View; controller menyusun representasi JSON untuk dikonsumsi UI.</w:t>
+      </w:r>
+    </w:p>
+    <w:p>
+      <w:pPr>
+        <w:pStyle w:val="ListParagraph"/>
+        <w:keepNext/>
+        <w:numPr>
+          <w:ilvl w:val="0"/>
+          <w:numId w:val="1"/>
+        </w:numPr>
+        <w:spacing w:after="100"/>
+      </w:pPr>
+      <w:r>
+        <w:rPr>
+          <w:rFonts w:ascii="Calibri" w:cs="Calibri" w:eastAsia="Calibri" w:hAnsi="Calibri"/>
+          <w:sz w:val="21"/>
+          <w:szCs w:val="21"/>
+        </w:rPr>
+        <w:t xml:space="preserve">Repository Pattern — akses data tiap modul diabstraksi lewat interface repository (UserRepository, EventRepository, RegistrationRepository, NotificationRepository), memenuhi NFR-SCAL-03 dan NFR-MOD-02.</w:t>
+      </w:r>
+    </w:p>
+    <w:p>
+      <w:pPr>
+        <w:pStyle w:val="ListParagraph"/>
+        <w:keepNext/>
+        <w:numPr>
+          <w:ilvl w:val="0"/>
+          <w:numId w:val="1"/>
+        </w:numPr>
+        <w:spacing w:after="100"/>
+      </w:pPr>
+      <w:r>
+        <w:rPr>
+          <w:rFonts w:ascii="Calibri" w:cs="Calibri" w:eastAsia="Calibri" w:hAnsi="Calibri"/>
+          <w:sz w:val="21"/>
+          <w:szCs w:val="21"/>
+        </w:rPr>
+        <w:t xml:space="preserve">Observer Pattern — EventBus menjadi mekanisme publish/subscribe antara modul Event/Pendaftaran dan modul Notifikasi, memenuhi NFR-MOD-04.</w:t>
+      </w:r>
+    </w:p>
+    <w:p>
+      <w:pPr>
+        <w:pStyle w:val="ListParagraph"/>
+        <w:keepNext w:val="0"/>
+        <w:numPr>
+          <w:ilvl w:val="0"/>
+          <w:numId w:val="1"/>
+        </w:numPr>
+        <w:spacing w:after="100"/>
+      </w:pPr>
+      <w:r>
+        <w:rPr>
+          <w:rFonts w:ascii="Calibri" w:cs="Calibri" w:eastAsia="Calibri" w:hAnsi="Calibri"/>
+          <w:sz w:val="21"/>
+          <w:szCs w:val="21"/>
+        </w:rPr>
+        <w:t xml:space="preserve">Facade — EventPublicApi menjadi satu-satunya titik akses modul lain ke modul Event, membatasi coupling hanya pada kontrak yang stabil.</w:t>
+      </w:r>
+    </w:p>
+    <w:p>
+      <w:pPr>
+        <w:keepNext/>
+        <w:pageBreakBefore w:val="0"/>
+        <w:spacing w:line="240" w:lineRule="auto" w:before="60" w:after="60"/>
         <w:jc w:val="center"/>
       </w:pPr>
       <w:r>
         <w:drawing>
-          <wp:inline distT="0" distB="0" distL="0" distR="0">
-            <wp:extent cx="5760720" cy="3855729"/>
-            <wp:effectExtent t="0" r="0" b="0" l="0"/>
-            <wp:docPr id="1" name="" descr="" title=""/>
+          <wp:inline xmlns:a="http://schemas.openxmlformats.org/drawingml/2006/main" xmlns:pic="http://schemas.openxmlformats.org/drawingml/2006/picture">
+            <wp:extent cx="6035040" cy="4255269"/>
+            <wp:docPr id="1" name="Gambar 1 Arsitektur Modular API EventKu gambaran hubungan" descr="Gambar 1 Arsitektur Modular API EventKu gambaran hubungan"/>
             <wp:cNvGraphicFramePr>
-              <a:graphicFrameLocks xmlns:a="http://schemas.openxmlformats.org/drawingml/2006/main" noChangeAspect="1"/>
+              <a:graphicFrameLocks noChangeAspect="1"/>
             </wp:cNvGraphicFramePr>
-            <a:graphic xmlns:a="http://schemas.openxmlformats.org/drawingml/2006/main">
+            <a:graphic>
               <a:graphicData uri="http://schemas.openxmlformats.org/drawingml/2006/picture">
-                <pic:pic xmlns:pic="http://schemas.openxmlformats.org/drawingml/2006/picture">
+                <pic:pic>
                   <pic:nvPicPr>
-                    <pic:cNvPr id="0" name="" descr=""/>
-                    <pic:cNvPicPr>
-                      <a:picLocks noChangeAspect="1" noChangeArrowheads="1"/>
-                    </pic:cNvPicPr>
+                    <pic:cNvPr id="0" name="EventKu - Tugas Bambang 5803024019 - Paket Lengkap (Satu Dokumen) - 03 _ Arsitektur modular EventKu.png"/>
+                    <pic:cNvPicPr/>
                   </pic:nvPicPr>
                   <pic:blipFill>
-                    <a:blip r:embed="rId7" cstate="none"/>
-                    <a:srcRect/>
+                    <a:blip r:embed="rId12"/>
+                    <a:srcRect l="4207" t="14153" r="6130" b="16270"/>
                     <a:stretch>
                       <a:fillRect/>
                     </a:stretch>
                   </pic:blipFill>
-                  <pic:spPr bwMode="auto">
+                  <pic:spPr>
                     <a:xfrm>
                       <a:off x="0" y="0"/>
-                      <a:ext cx="5760720" cy="3855729"/>
+                      <a:ext cx="6035040" cy="4255269"/>
                     </a:xfrm>
-                    <a:prstGeom prst="rect">
-                      <a:avLst/>
-                    </a:prstGeom>
+                    <a:prstGeom prst="rect"/>
                   </pic:spPr>
                 </pic:pic>
               </a:graphicData>
@@ -695,23 +919,64 @@
     </w:p>
     <w:p>
       <w:pPr>
-        <w:spacing w:after="260"/>
+        <w:keepNext w:val="0"/>
+        <w:pageBreakBefore w:val="0"/>
+        <w:spacing w:before="40" w:after="160"/>
         <w:jc w:val="center"/>
       </w:pPr>
       <w:r>
         <w:rPr>
+          <w:rFonts w:ascii="Calibri" w:hAnsi="Calibri"/>
+          <w:i/>
+          <w:sz w:val="20"/>
+        </w:rPr>
+        <w:t>Gambar 1. Arsitektur Modular API EventKu (ekspor Lucidchart)</w:t>
+      </w:r>
+    </w:p>
+    <w:p>
+      <w:pPr>
+        <w:keepNext/>
+        <w:keepLines/>
+        <w:pageBreakBefore w:val="0"/>
+        <w:spacing w:after="160" w:before="320"/>
+      </w:pPr>
+      <w:r>
+        <w:rPr>
           <w:rFonts w:ascii="Calibri" w:cs="Calibri" w:eastAsia="Calibri" w:hAnsi="Calibri"/>
-          <w:i/>
-          <w:iCs/>
-          <w:color w:val="555555"/>
-          <w:sz w:val="18"/>
-          <w:szCs w:val="18"/>
-        </w:rPr>
-        <w:t xml:space="preserve">Gambar 1. Arsitektur Modular API EventKu (Modular Monolith)</w:t>
-      </w:r>
-    </w:p>
-    <w:p>
-      <w:pPr>
+          <w:b/>
+          <w:bCs/>
+          <w:color w:val="1F3864"/>
+          <w:sz w:val="30"/>
+          <w:szCs w:val="30"/>
+        </w:rPr>
+        <w:t xml:space="preserve">3. Class Diagram per Modul</w:t>
+      </w:r>
+    </w:p>
+    <w:p>
+      <w:pPr>
+        <w:spacing w:after="120" w:before="0"/>
+      </w:pPr>
+      <w:r>
+        <w:rPr>
+          <w:rFonts w:ascii="Calibri" w:cs="Calibri" w:eastAsia="Calibri" w:hAnsi="Calibri"/>
+          <w:sz w:val="22"/>
+          <w:szCs w:val="22"/>
+        </w:rPr>
+        <w:t>Class diagram berikut memuat entitas, controller, service, kontrak repository, dan komponen infrastruktur keempat modul. Panah dependensi mengarah dari pemakai ke komponen yang dipakai, misalnya Controller → Service. Garis putus-putus berujung segitiga kosong menunjukkan implementasi repository SQL terhadap interface; relasi entitas pada ERD diberi kardinalitas.</w:t>
+      </w:r>
+      <w:r>
+        <w:rPr>
+          <w:rFonts w:ascii="Calibri" w:cs="Calibri" w:eastAsia="Calibri" w:hAnsi="Calibri"/>
+          <w:sz w:val="22"/>
+          <w:szCs w:val="22"/>
+        </w:rPr>
+        <w:t xml:space="preserve"> Gambar 2 sampai Gambar 5 ditempatkan pada subbagian modul yang sesuai.</w:t>
+      </w:r>
+    </w:p>
+    <w:p>
+      <w:pPr>
+        <w:keepNext/>
+        <w:keepLines/>
         <w:spacing w:after="160" w:before="320"/>
       </w:pPr>
       <w:r>
@@ -723,7 +988,423 @@
           <w:sz w:val="25"/>
           <w:szCs w:val="25"/>
         </w:rPr>
-        <w:t xml:space="preserve">2.1 Pola Komunikasi Antar Modul</w:t>
+        <w:t xml:space="preserve">3.1 Modul Auth</w:t>
+      </w:r>
+    </w:p>
+    <w:p>
+      <w:pPr>
+        <w:spacing w:after="120" w:before="0"/>
+      </w:pPr>
+      <w:r>
+        <w:rPr>
+          <w:rFonts w:ascii="Calibri" w:cs="Calibri" w:eastAsia="Calibri" w:hAnsi="Calibri"/>
+          <w:sz w:val="22"/>
+          <w:szCs w:val="22"/>
+        </w:rPr>
+        <w:t xml:space="preserve">Algoritma inti: AuthService.authenticate melakukan verifikasi password ter-hash (bcrypt) terhadap email yang dicari lewat UserRepository.findByEmail, kemudian JwtProvider.sign menghasilkan token berisi userId dan role untuk dipakai RoleGuard pada permintaan berikutnya (mendukung US-AUTH-03, US-AUTH-05).</w:t>
+      </w:r>
+      <w:r>
+        <w:rPr>
+          <w:rFonts w:ascii="Calibri" w:cs="Calibri" w:eastAsia="Calibri" w:hAnsi="Calibri"/>
+          <w:sz w:val="22"/>
+          <w:szCs w:val="22"/>
+        </w:rPr>
+        <w:t xml:space="preserve"> Registrasi publik hanya membuat akun mahasiswa atau penyelenggara; akun admin dibuat secara internal. DTO pengguna tidak menyertakan password_hash.</w:t>
+      </w:r>
+    </w:p>
+    <w:p>
+      <w:pPr>
+        <w:keepNext/>
+        <w:pageBreakBefore w:val="0"/>
+        <w:spacing w:line="240" w:lineRule="auto" w:before="60" w:after="60"/>
+        <w:jc w:val="center"/>
+      </w:pPr>
+      <w:r>
+        <w:drawing>
+          <wp:inline xmlns:a="http://schemas.openxmlformats.org/drawingml/2006/main" xmlns:pic="http://schemas.openxmlformats.org/drawingml/2006/picture">
+            <wp:extent cx="6035040" cy="3578087"/>
+            <wp:docPr id="15" name="Gambar 2 Class Diagram Modul Auth gambaran hubungan" descr="Gambar 2 Class Diagram Modul Auth gambaran hubungan"/>
+            <wp:cNvGraphicFramePr>
+              <a:graphicFrameLocks noChangeAspect="1"/>
+            </wp:cNvGraphicFramePr>
+            <a:graphic>
+              <a:graphicData uri="http://schemas.openxmlformats.org/drawingml/2006/picture">
+                <pic:pic>
+                  <pic:nvPicPr>
+                    <pic:cNvPr id="0" name="EventKu - Tugas Bambang 5803024019 - Paket Lengkap (Satu Dokumen) - 04 _ Class diagram Auth.png"/>
+                    <pic:cNvPicPr/>
+                  </pic:nvPicPr>
+                  <pic:blipFill>
+                    <a:blip r:embed="rId15"/>
+                    <a:srcRect l="5912" t="18411" r="8615" b="23450"/>
+                    <a:stretch>
+                      <a:fillRect/>
+                    </a:stretch>
+                  </pic:blipFill>
+                  <pic:spPr>
+                    <a:xfrm>
+                      <a:off x="0" y="0"/>
+                      <a:ext cx="6035040" cy="3578087"/>
+                    </a:xfrm>
+                    <a:prstGeom prst="rect"/>
+                  </pic:spPr>
+                </pic:pic>
+              </a:graphicData>
+            </a:graphic>
+          </wp:inline>
+        </w:drawing>
+      </w:r>
+    </w:p>
+    <w:p>
+      <w:pPr>
+        <w:keepNext w:val="0"/>
+        <w:pageBreakBefore w:val="0"/>
+        <w:spacing w:before="40" w:after="160"/>
+        <w:jc w:val="center"/>
+      </w:pPr>
+      <w:r>
+        <w:rPr>
+          <w:rFonts w:ascii="Calibri" w:hAnsi="Calibri"/>
+          <w:i/>
+          <w:sz w:val="20"/>
+        </w:rPr>
+        <w:t>Gambar 2. Class Diagram Modul Auth (ekspor Lucidchart)</w:t>
+      </w:r>
+    </w:p>
+    <w:p>
+      <w:pPr>
+        <w:keepNext/>
+        <w:keepLines/>
+        <w:spacing w:after="160" w:before="320"/>
+      </w:pPr>
+      <w:r>
+        <w:rPr>
+          <w:rFonts w:ascii="Calibri" w:cs="Calibri" w:eastAsia="Calibri" w:hAnsi="Calibri"/>
+          <w:b/>
+          <w:bCs/>
+          <w:color w:val="1F3864"/>
+          <w:sz w:val="25"/>
+          <w:szCs w:val="25"/>
+        </w:rPr>
+        <w:t xml:space="preserve">3.2 Modul Event</w:t>
+      </w:r>
+    </w:p>
+    <w:p>
+      <w:pPr>
+        <w:spacing w:after="120" w:before="0"/>
+      </w:pPr>
+      <w:r>
+        <w:rPr>
+          <w:rFonts w:ascii="Calibri" w:cs="Calibri" w:eastAsia="Calibri" w:hAnsi="Calibri"/>
+          <w:sz w:val="22"/>
+          <w:szCs w:val="22"/>
+        </w:rPr>
+        <w:t>EventService.searchEvents menggabungkan filter q, category, organizer, serta date atau from/to, kemudian meminta repository melakukan COUNT, pengurutan stabil date_time lalu event_id, dan pagination page/limit (default dan maksimum 20 sesuai NFR-PERF-02). Rentang [from,to) berarti from ≤ date_time &lt; to. Status diajukan hanya dapat menjadi disetujui atau ditolak melalui moderate/approve/reject oleh admin. markCompleted mengubah disetujui menjadi selesai jika pelaksanaan telah berakhir dan date_time terlewati, dengan izin pemilik atau admin. PUT/DELETE dibatasi pada pemilik event diajukan/ditolak; edit event ditolak mengajukan ulang. Listing publik hanya mengembalikan disetujui; owner/admin mengakses daftar internal dengan JWT/RBAC.</w:t>
+      </w:r>
+    </w:p>
+    <w:p>
+      <w:pPr>
+        <w:keepNext/>
+        <w:pageBreakBefore w:val="0"/>
+        <w:spacing w:line="240" w:lineRule="auto" w:before="60" w:after="60"/>
+        <w:jc w:val="center"/>
+      </w:pPr>
+      <w:r>
+        <w:drawing>
+          <wp:inline xmlns:a="http://schemas.openxmlformats.org/drawingml/2006/main" xmlns:pic="http://schemas.openxmlformats.org/drawingml/2006/picture">
+            <wp:extent cx="6035040" cy="3852406"/>
+            <wp:docPr id="16" name="Gambar 3 Class Diagram Modul Event gambaran hubungan" descr="Gambar 3 Class Diagram Modul Event gambaran hubungan"/>
+            <wp:cNvGraphicFramePr>
+              <a:graphicFrameLocks noChangeAspect="1"/>
+            </wp:cNvGraphicFramePr>
+            <a:graphic>
+              <a:graphicData uri="http://schemas.openxmlformats.org/drawingml/2006/picture">
+                <pic:pic>
+                  <pic:nvPicPr>
+                    <pic:cNvPr id="0" name="EventKu - Tugas Bambang 5803024019 - Paket Lengkap (Satu Dokumen) - 05 _ Class diagram Event.png"/>
+                    <pic:cNvPicPr/>
+                  </pic:nvPicPr>
+                  <pic:blipFill>
+                    <a:blip r:embed="rId16"/>
+                    <a:srcRect l="5912" t="17797" r="8615" b="21694"/>
+                    <a:stretch>
+                      <a:fillRect/>
+                    </a:stretch>
+                  </pic:blipFill>
+                  <pic:spPr>
+                    <a:xfrm>
+                      <a:off x="0" y="0"/>
+                      <a:ext cx="6035040" cy="3852406"/>
+                    </a:xfrm>
+                    <a:prstGeom prst="rect"/>
+                  </pic:spPr>
+                </pic:pic>
+              </a:graphicData>
+            </a:graphic>
+          </wp:inline>
+        </w:drawing>
+      </w:r>
+    </w:p>
+    <w:p>
+      <w:pPr>
+        <w:keepNext w:val="0"/>
+        <w:pageBreakBefore w:val="0"/>
+        <w:spacing w:before="40" w:after="160"/>
+        <w:jc w:val="center"/>
+      </w:pPr>
+      <w:r>
+        <w:rPr>
+          <w:rFonts w:ascii="Calibri" w:hAnsi="Calibri"/>
+          <w:i/>
+          <w:sz w:val="20"/>
+        </w:rPr>
+        <w:t>Gambar 3. Class Diagram Modul Event (ekspor Lucidchart)</w:t>
+      </w:r>
+    </w:p>
+    <w:p>
+      <w:pPr>
+        <w:keepNext/>
+        <w:keepLines/>
+        <w:spacing w:after="160" w:before="320"/>
+      </w:pPr>
+      <w:r>
+        <w:rPr>
+          <w:rFonts w:ascii="Calibri" w:cs="Calibri" w:eastAsia="Calibri" w:hAnsi="Calibri"/>
+          <w:b/>
+          <w:bCs/>
+          <w:color w:val="1F3864"/>
+          <w:sz w:val="25"/>
+          <w:szCs w:val="25"/>
+        </w:rPr>
+        <w:t xml:space="preserve">3.3 Modul Pendaftaran / RSVP</w:t>
+      </w:r>
+    </w:p>
+    <w:p>
+      <w:pPr>
+        <w:spacing w:after="120" w:before="0"/>
+      </w:pPr>
+      <w:r>
+        <w:rPr>
+          <w:rFonts w:ascii="Calibri" w:cs="Calibri" w:eastAsia="Calibri" w:hAnsi="Calibri"/>
+          <w:sz w:val="22"/>
+          <w:szCs w:val="22"/>
+        </w:rPr>
+        <w:t>RegistrationService.registerStudent memvalidasi role mahasiswa dan mengambil atau mengaktifkan kembali Registration melalui RegistrationRepository. EventPublicApi.reserveSeat dan simpan RSVP memakai satu TransactionManager/tx yang sama. Event.reserved_seats dinaikkan secara atomik hanya jika status disetujui, jadwal belum lewat, dan reserved_seats &lt; quota. UNIQUE(event_id,student_id) mencegah RSVP ganda. Pembatalan mengubah aktif menjadi dibatalkan dan memanggil releaseSeat dalam transaksi yang sama; pembatalan berulang tidak mengurangi kuota lagi. StudentRegistered diterbitkan sesudah commit. Counter kuota dimiliki Event sehingga EventRepository tidak membaca tabel Registration milik modul lain.</w:t>
+      </w:r>
+      <w:r>
+        <w:rPr>
+          <w:rFonts w:ascii="Calibri" w:cs="Calibri" w:eastAsia="Calibri" w:hAnsi="Calibri"/>
+          <w:sz w:val="22"/>
+          <w:szCs w:val="22"/>
+        </w:rPr>
+        <w:t xml:space="preserve"> RSVP yang sudah aktif ditolak atau menjadi no-op tanpa menambah kursi. Aktivasi ulang memperbarui registered_at dan mengosongkan cancelled_at. Kegagalan reservasi atau penyimpanan membatalkan seluruh transaksi.</w:t>
+      </w:r>
+    </w:p>
+    <w:p>
+      <w:pPr>
+        <w:keepNext/>
+        <w:pageBreakBefore w:val="0"/>
+        <w:spacing w:line="240" w:lineRule="auto" w:before="60" w:after="60"/>
+        <w:jc w:val="center"/>
+      </w:pPr>
+      <w:r>
+        <w:drawing>
+          <wp:inline xmlns:a="http://schemas.openxmlformats.org/drawingml/2006/main" xmlns:pic="http://schemas.openxmlformats.org/drawingml/2006/picture">
+            <wp:extent cx="6035040" cy="4723074"/>
+            <wp:docPr id="23" name="Gambar 4 Class Diagram Modul Pendaftaran dan RSVP gambaran hubungan" descr="Gambar 4 Class Diagram Modul Pendaftaran dan RSVP gambaran hubungan"/>
+            <wp:cNvGraphicFramePr>
+              <a:graphicFrameLocks noChangeAspect="1"/>
+            </wp:cNvGraphicFramePr>
+            <a:graphic>
+              <a:graphicData uri="http://schemas.openxmlformats.org/drawingml/2006/picture">
+                <pic:pic>
+                  <pic:nvPicPr>
+                    <pic:cNvPr id="0" name="EventKu - Tugas Bambang 5803024019 - Paket Lengkap (Satu Dokumen) - 06 _ Class diagram Pendaftaran.png"/>
+                    <pic:cNvPicPr/>
+                  </pic:nvPicPr>
+                  <pic:blipFill>
+                    <a:blip r:embed="rId17"/>
+                    <a:srcRect l="5912" t="15127" r="8615" b="21815"/>
+                    <a:stretch>
+                      <a:fillRect/>
+                    </a:stretch>
+                  </pic:blipFill>
+                  <pic:spPr>
+                    <a:xfrm>
+                      <a:off x="0" y="0"/>
+                      <a:ext cx="6035040" cy="4723074"/>
+                    </a:xfrm>
+                    <a:prstGeom prst="rect"/>
+                  </pic:spPr>
+                </pic:pic>
+              </a:graphicData>
+            </a:graphic>
+          </wp:inline>
+        </w:drawing>
+      </w:r>
+    </w:p>
+    <w:p>
+      <w:pPr>
+        <w:keepNext w:val="0"/>
+        <w:pageBreakBefore w:val="0"/>
+        <w:spacing w:before="40" w:after="160"/>
+        <w:jc w:val="center"/>
+      </w:pPr>
+      <w:r>
+        <w:rPr>
+          <w:rFonts w:ascii="Calibri" w:hAnsi="Calibri"/>
+          <w:i/>
+          <w:sz w:val="20"/>
+        </w:rPr>
+        <w:t>Gambar 4. Class Diagram Modul Pendaftaran dan RSVP (ekspor Lucidchart)</w:t>
+      </w:r>
+    </w:p>
+    <w:p>
+      <w:pPr>
+        <w:keepNext/>
+        <w:keepLines/>
+        <w:spacing w:after="160" w:before="320"/>
+      </w:pPr>
+      <w:r>
+        <w:rPr>
+          <w:rFonts w:ascii="Calibri" w:cs="Calibri" w:eastAsia="Calibri" w:hAnsi="Calibri"/>
+          <w:b/>
+          <w:bCs/>
+          <w:color w:val="1F3864"/>
+          <w:sz w:val="25"/>
+          <w:szCs w:val="25"/>
+        </w:rPr>
+        <w:t xml:space="preserve">3.4 Modul Notifikasi</w:t>
+      </w:r>
+    </w:p>
+    <w:p>
+      <w:pPr>
+        <w:spacing w:after="120" w:before="0"/>
+      </w:pPr>
+      <w:r>
+        <w:rPr>
+          <w:rFonts w:ascii="Calibri" w:cs="Calibri" w:eastAsia="Calibri" w:hAnsi="Calibri"/>
+          <w:sz w:val="22"/>
+          <w:szCs w:val="22"/>
+        </w:rPr>
+        <w:t>NotificationService.onEventApproved memilih mahasiswa melalui SubscriptionRepository berdasarkan CategorySubscription dan menyimpan notifikasi new_event. onStudentRegistered menyimpan registration_confirmation untuk mahasiswa yang mendaftar. Scheduler mengambil event disetujui mendatang melalui EventPublicApi.findUpcoming lalu memanggil notifyUpcoming; penerima upcoming_reminder adalah mahasiswa yang berminat pada kategori event. UNIQUE(user_id,event_id,type) mencegah pengiriman berulang. is_read mencatat apakah notifikasi sudah dibaca. Mahasiswa adalah penerima data; handler NotificationService merupakan Observer aplikasi.</w:t>
+      </w:r>
+      <w:r>
+        <w:rPr>
+          <w:rFonts w:ascii="Calibri" w:cs="Calibri" w:eastAsia="Calibri" w:hAnsi="Calibri"/>
+          <w:sz w:val="22"/>
+          <w:szCs w:val="22"/>
+        </w:rPr>
+        <w:t xml:space="preserve"> Notifikasi baru memiliki is_read=false; jendela pengingat scheduler dapat dikonfigurasi. SubscriptionRepository mengelola CategorySubscription untuk menyimpan minat kategori.</w:t>
+      </w:r>
+    </w:p>
+    <w:p>
+      <w:pPr>
+        <w:keepNext/>
+        <w:pageBreakBefore w:val="0"/>
+        <w:spacing w:line="240" w:lineRule="auto" w:before="60" w:after="60"/>
+        <w:jc w:val="center"/>
+      </w:pPr>
+      <w:r>
+        <w:drawing>
+          <wp:inline xmlns:a="http://schemas.openxmlformats.org/drawingml/2006/main" xmlns:pic="http://schemas.openxmlformats.org/drawingml/2006/picture">
+            <wp:extent cx="6035040" cy="4755437"/>
+            <wp:docPr id="31" name="Gambar 5 Class Diagram Modul Notifikasi gambaran hubungan" descr="Gambar 5 Class Diagram Modul Notifikasi gambaran hubungan"/>
+            <wp:cNvGraphicFramePr>
+              <a:graphicFrameLocks noChangeAspect="1"/>
+            </wp:cNvGraphicFramePr>
+            <a:graphic>
+              <a:graphicData uri="http://schemas.openxmlformats.org/drawingml/2006/picture">
+                <pic:pic>
+                  <pic:nvPicPr>
+                    <pic:cNvPr id="0" name="EventKu - Tugas Bambang 5803024019 - Paket Lengkap (Satu Dokumen) - 07 _ Class diagram Notifikasi.png"/>
+                    <pic:cNvPicPr/>
+                  </pic:nvPicPr>
+                  <pic:blipFill>
+                    <a:blip r:embed="rId18"/>
+                    <a:srcRect l="5912" t="15127" r="5338" b="18949"/>
+                    <a:stretch>
+                      <a:fillRect/>
+                    </a:stretch>
+                  </pic:blipFill>
+                  <pic:spPr>
+                    <a:xfrm>
+                      <a:off x="0" y="0"/>
+                      <a:ext cx="6035040" cy="4755437"/>
+                    </a:xfrm>
+                    <a:prstGeom prst="rect"/>
+                  </pic:spPr>
+                </pic:pic>
+              </a:graphicData>
+            </a:graphic>
+          </wp:inline>
+        </w:drawing>
+      </w:r>
+    </w:p>
+    <w:p>
+      <w:pPr>
+        <w:keepNext w:val="0"/>
+        <w:pageBreakBefore w:val="0"/>
+        <w:spacing w:before="40" w:after="160"/>
+        <w:jc w:val="center"/>
+      </w:pPr>
+      <w:r>
+        <w:rPr>
+          <w:rFonts w:ascii="Calibri" w:hAnsi="Calibri"/>
+          <w:i/>
+          <w:sz w:val="20"/>
+        </w:rPr>
+        <w:t>Gambar 5. Class Diagram Modul Notifikasi (ekspor Lucidchart)</w:t>
+      </w:r>
+    </w:p>
+    <w:p>
+      <w:pPr>
+        <w:keepNext/>
+        <w:keepLines/>
+        <w:pageBreakBefore w:val="0"/>
+        <w:spacing w:after="160" w:before="320"/>
+      </w:pPr>
+      <w:r>
+        <w:rPr>
+          <w:rFonts w:ascii="Calibri" w:cs="Calibri" w:eastAsia="Calibri" w:hAnsi="Calibri"/>
+          <w:b/>
+          <w:bCs/>
+          <w:color w:val="1F3864"/>
+          <w:sz w:val="30"/>
+          <w:szCs w:val="30"/>
+        </w:rPr>
+        <w:t xml:space="preserve">4. ERD Final</w:t>
+      </w:r>
+    </w:p>
+    <w:p>
+      <w:pPr>
+        <w:spacing w:after="120" w:before="0"/>
+      </w:pPr>
+      <w:r>
+        <w:rPr>
+          <w:rFonts w:ascii="Calibri" w:cs="Calibri" w:eastAsia="Calibri" w:hAnsi="Calibri"/>
+          <w:sz w:val="22"/>
+          <w:szCs w:val="22"/>
+        </w:rPr>
+        <w:t>ERD final mempertahankan User dengan role ENUM, EventCategory, serta jadwal date_time, lokasi location_or_link, dan moderator moderated_by dari draft Minggu 5. Modul Pendaftaran dan Notifikasi menambahkan Registration, Notification, dan CategorySubscription. Perincian final juga menambahkan Event.reserved_seats untuk reservasi kuota atomik serta Notification.type untuk membedakan notifikasi dan mencegah duplikasi. Tipe fisik ID masih dipilih bersama tim pada Minggu 9.</w:t>
+      </w:r>
+    </w:p>
+    <w:p>
+      <w:pPr>
+        <w:keepNext/>
+        <w:keepLines/>
+        <w:spacing w:after="160" w:before="320"/>
+      </w:pPr>
+      <w:r>
+        <w:rPr>
+          <w:rFonts w:ascii="Calibri" w:cs="Calibri" w:eastAsia="Calibri" w:hAnsi="Calibri"/>
+          <w:b/>
+          <w:bCs/>
+          <w:color w:val="1F3864"/>
+          <w:sz w:val="25"/>
+          <w:szCs w:val="25"/>
+        </w:rPr>
+        <w:t xml:space="preserve">4.1 Entitas &amp; Relasi Tambahan</w:t>
       </w:r>
     </w:p>
     <w:p>
@@ -741,7 +1422,7 @@
           <w:sz w:val="21"/>
           <w:szCs w:val="21"/>
         </w:rPr>
-        <w:t xml:space="preserve">Frontend ↔ Backend: REST API bertukar JSON melalui HTTPS, dengan token JWT dikirim pada header Authorization: Bearer &lt;token&gt; untuk setiap permintaan yang memerlukan autentikasi.</w:t>
+        <w:t>Registration mencatat RSVP mahasiswa ke event. Relasi Event 1:N Registration dan User 1:N Registration wajib pada setiap baris Registration. Status aktif/dibatalkan mempertahankan riwayat; UNIQUE(event_id,student_id) berarti pendaftaran kembali mengaktifkan baris yang sama. cancelled_at opsional mencatat waktu pembatalan.</w:t>
       </w:r>
     </w:p>
     <w:p>
@@ -759,7 +1440,7 @@
           <w:sz w:val="21"/>
           <w:szCs w:val="21"/>
         </w:rPr>
-        <w:t xml:space="preserve">Modul Pendaftaran → Modul Event: panggilan sinkron langsung antar modul dihindari sesuai NFR-MOD-04; Pendaftaran mengakses data Event hanya melalui fasad EventPublicApi (baca detail event, reserveSeat, releaseSeat), bukan mengimpor EventRepository secara langsung.</w:t>
+        <w:t>Notification memiliki user_id dan event_id wajib, type (new_event, registration_confirmation, upcoming_reminder), is_read, dan created_at. UNIQUE(user_id,event_id,type) membatasi satu notifikasi tiap jenis untuk satu penerima dan event. EventApproved dan StudentRegistered diproses setelah commit; scheduler menjalankan pengingat mendatang menurut minat kategori.</w:t>
       </w:r>
     </w:p>
     <w:p>
@@ -777,7 +1458,7 @@
           <w:sz w:val="21"/>
           <w:szCs w:val="21"/>
         </w:rPr>
-        <w:t xml:space="preserve">Modul Event / Pendaftaran → Modul Notifikasi: mengikuti pola Observer melalui EventBus in-process. Modul Event mem-publish event domain (mis. EventApproved) dan modul Pendaftaran mem-publish StudentRegistered; modul Notifikasi subscribe pada kedua event tersebut tanpa modul Event/Pendaftaran perlu mengenal modul Notifikasi (US-EVENT-06, NFR-MOD-04).</w:t>
+        <w:t>CategorySubscription memiliki subscription_id sebagai primary key, student_id dan category_id sebagai foreign key wajib. UNIQUE(student_id,category_id) mencegah langganan kategori ganda. SubscriptionRepository hanya menerima mahasiswa sebagai student dan memilih penerima new_event serta upcoming_reminder berdasarkan kategori.</w:t>
       </w:r>
     </w:p>
     <w:p>
@@ -795,29 +1476,72 @@
           <w:sz w:val="21"/>
           <w:szCs w:val="21"/>
         </w:rPr>
-        <w:t xml:space="preserve">Seluruh modul mengakses basis data hanya melalui repository miliknya sendiri (Repository Pattern, NFR-MOD-02); tidak ada query langsung dari controller/service ke tabel milik modul lain.</w:t>
-      </w:r>
-    </w:p>
-    <w:p>
-      <w:pPr>
-        <w:pStyle w:val="ListParagraph"/>
-        <w:numPr>
-          <w:ilvl w:val="0"/>
-          <w:numId w:val="1"/>
-        </w:numPr>
-        <w:spacing w:after="100"/>
-      </w:pPr>
-      <w:r>
-        <w:rPr>
-          <w:rFonts w:ascii="Calibri" w:cs="Calibri" w:eastAsia="Calibri" w:hAnsi="Calibri"/>
-          <w:sz w:val="21"/>
-          <w:szCs w:val="21"/>
-        </w:rPr>
-        <w:t xml:space="preserve">Shared Kernel menampung kebutuhan lintas modul yang bersifat infrastruktural (JwtProvider, AuthMiddleware, RoleGuard, TransactionManager) sehingga tidak terjadi duplikasi logika otorisasi di tiap modul.</w:t>
-      </w:r>
-    </w:p>
-    <w:p>
-      <w:pPr>
+        <w:t>Foreign key pada baris anak wajib kecuali moderated_by pada Event, yang boleh NULL selama diajukan. Satu induk dapat belum memiliki baris anak (0..N). Event.reserved_seats bernilai awal 0 dan selalu berada antara 0 dan quota; jumlah ini diperbarui bersama transaksi RSVP dan tidak diganti dari input klien.</w:t>
+      </w:r>
+    </w:p>
+    <w:p>
+      <w:pPr>
+        <w:keepNext/>
+        <w:pageBreakBefore w:val="0"/>
+        <w:spacing w:line="240" w:lineRule="auto" w:before="60" w:after="60"/>
+        <w:jc w:val="center"/>
+      </w:pPr>
+      <w:r>
+        <w:drawing>
+          <wp:inline xmlns:a="http://schemas.openxmlformats.org/drawingml/2006/main" xmlns:pic="http://schemas.openxmlformats.org/drawingml/2006/picture">
+            <wp:extent cx="6035040" cy="5424873"/>
+            <wp:docPr id="41" name="Gambar 6 ERD Final EventKu gambaran hubungan" descr="Gambar 6 ERD Final EventKu gambaran hubungan"/>
+            <wp:cNvGraphicFramePr>
+              <a:graphicFrameLocks noChangeAspect="1"/>
+            </wp:cNvGraphicFramePr>
+            <a:graphic>
+              <a:graphicData uri="http://schemas.openxmlformats.org/drawingml/2006/picture">
+                <pic:pic>
+                  <pic:nvPicPr>
+                    <pic:cNvPr id="0" name="EventKu - Tugas Bambang 5803024019 - Paket Lengkap (Satu Dokumen) - 02 _ ERD final - EventKu.png"/>
+                    <pic:cNvPicPr/>
+                  </pic:nvPicPr>
+                  <pic:blipFill>
+                    <a:blip r:embed="rId19"/>
+                    <a:srcRect l="22668" t="9392" r="5021" b="29941"/>
+                    <a:stretch>
+                      <a:fillRect/>
+                    </a:stretch>
+                  </pic:blipFill>
+                  <pic:spPr>
+                    <a:xfrm>
+                      <a:off x="0" y="0"/>
+                      <a:ext cx="6035040" cy="5424873"/>
+                    </a:xfrm>
+                    <a:prstGeom prst="rect"/>
+                  </pic:spPr>
+                </pic:pic>
+              </a:graphicData>
+            </a:graphic>
+          </wp:inline>
+        </w:drawing>
+      </w:r>
+    </w:p>
+    <w:p>
+      <w:pPr>
+        <w:keepNext w:val="0"/>
+        <w:pageBreakBefore w:val="0"/>
+        <w:spacing w:before="40" w:after="160"/>
+        <w:jc w:val="center"/>
+      </w:pPr>
+      <w:r>
+        <w:rPr>
+          <w:rFonts w:ascii="Calibri" w:hAnsi="Calibri"/>
+          <w:i/>
+          <w:sz w:val="20"/>
+        </w:rPr>
+        <w:t>Gambar 6. ERD Final EventKu (ekspor Lucidchart)</w:t>
+      </w:r>
+    </w:p>
+    <w:p>
+      <w:pPr>
+        <w:keepNext/>
+        <w:keepLines/>
         <w:spacing w:after="160" w:before="320"/>
       </w:pPr>
       <w:r>
@@ -829,83 +1553,85 @@
           <w:sz w:val="25"/>
           <w:szCs w:val="25"/>
         </w:rPr>
-        <w:t xml:space="preserve">2.2 Keterkaitan dengan Design Pattern</w:t>
-      </w:r>
-    </w:p>
-    <w:p>
-      <w:pPr>
-        <w:pStyle w:val="ListParagraph"/>
-        <w:numPr>
-          <w:ilvl w:val="0"/>
-          <w:numId w:val="1"/>
-        </w:numPr>
-        <w:spacing w:after="100"/>
-      </w:pPr>
-      <w:r>
-        <w:rPr>
-          <w:rFonts w:ascii="Calibri" w:cs="Calibri" w:eastAsia="Calibri" w:hAnsi="Calibri"/>
-          <w:sz w:val="21"/>
-          <w:szCs w:val="21"/>
-        </w:rPr>
-        <w:t xml:space="preserve">MVC — struktur route (view API) → controller → service memisahkan penanganan HTTP dari logika bisnis pada setiap modul.</w:t>
-      </w:r>
-    </w:p>
-    <w:p>
-      <w:pPr>
-        <w:pStyle w:val="ListParagraph"/>
-        <w:numPr>
-          <w:ilvl w:val="0"/>
-          <w:numId w:val="1"/>
-        </w:numPr>
-        <w:spacing w:after="100"/>
-      </w:pPr>
-      <w:r>
-        <w:rPr>
-          <w:rFonts w:ascii="Calibri" w:cs="Calibri" w:eastAsia="Calibri" w:hAnsi="Calibri"/>
-          <w:sz w:val="21"/>
-          <w:szCs w:val="21"/>
-        </w:rPr>
-        <w:t xml:space="preserve">Repository Pattern — akses data tiap modul diabstraksi lewat interface repository (UserRepository, EventRepository, RegistrationRepository, NotificationRepository), memenuhi NFR-SCAL-03 dan NFR-MOD-02.</w:t>
-      </w:r>
-    </w:p>
-    <w:p>
-      <w:pPr>
-        <w:pStyle w:val="ListParagraph"/>
-        <w:numPr>
-          <w:ilvl w:val="0"/>
-          <w:numId w:val="1"/>
-        </w:numPr>
-        <w:spacing w:after="100"/>
-      </w:pPr>
-      <w:r>
-        <w:rPr>
-          <w:rFonts w:ascii="Calibri" w:cs="Calibri" w:eastAsia="Calibri" w:hAnsi="Calibri"/>
-          <w:sz w:val="21"/>
-          <w:szCs w:val="21"/>
-        </w:rPr>
-        <w:t xml:space="preserve">Observer Pattern — EventBus menjadi mekanisme publish/subscribe antara modul Event/Pendaftaran dan modul Notifikasi, memenuhi NFR-MOD-04.</w:t>
-      </w:r>
-    </w:p>
-    <w:p>
-      <w:pPr>
-        <w:pStyle w:val="ListParagraph"/>
-        <w:numPr>
-          <w:ilvl w:val="0"/>
-          <w:numId w:val="1"/>
-        </w:numPr>
-        <w:spacing w:after="100"/>
-      </w:pPr>
-      <w:r>
-        <w:rPr>
-          <w:rFonts w:ascii="Calibri" w:cs="Calibri" w:eastAsia="Calibri" w:hAnsi="Calibri"/>
-          <w:sz w:val="21"/>
-          <w:szCs w:val="21"/>
-        </w:rPr>
-        <w:t xml:space="preserve">Facade — EventPublicApi menjadi satu-satunya titik akses modul lain ke modul Event, membatasi coupling hanya pada kontrak yang stabil.</w:t>
-      </w:r>
-    </w:p>
-    <w:p>
-      <w:pPr>
+        <w:t>4.2 Algoritma Pencarian dan Filter</w:t>
+      </w:r>
+    </w:p>
+    <w:p>
+      <w:pPr>
+        <w:spacing w:after="140"/>
+      </w:pPr>
+      <w:r>
+        <w:rPr>
+          <w:rFonts w:ascii="Calibri" w:hAnsi="Calibri"/>
+          <w:sz w:val="22"/>
+        </w:rPr>
+        <w:t>Gambar 7 memperlihatkan urutan pencarian dari validasi parameter hingga pagination. Semua filter opsional digabungkan dengan AND; repository menjalankan query berparameter dan query publik selalu membatasi status disetujui. Rentang tanggal menggunakan batas akhir eksklusif, sedangkan hasil diurutkan menurut date_time dan event_id agar pagination konsisten. Rincian parameter dan respons tetap mengikuti kontrak API pada bagian 5.</w:t>
+      </w:r>
+    </w:p>
+    <w:p>
+      <w:pPr>
+        <w:keepNext/>
+        <w:pageBreakBefore w:val="0"/>
+        <w:spacing w:line="240" w:lineRule="auto" w:before="60" w:after="60"/>
+        <w:jc w:val="center"/>
+      </w:pPr>
+      <w:r>
+        <w:drawing>
+          <wp:inline xmlns:a="http://schemas.openxmlformats.org/drawingml/2006/main" xmlns:pic="http://schemas.openxmlformats.org/drawingml/2006/picture">
+            <wp:extent cx="6035040" cy="4114800"/>
+            <wp:docPr id="48" name="Gambar 7 Algoritma Pencarian dan Filter Event gambaran hubungan" descr="Gambar 7 Algoritma Pencarian dan Filter Event gambaran hubungan"/>
+            <wp:cNvGraphicFramePr>
+              <a:graphicFrameLocks noChangeAspect="1"/>
+            </wp:cNvGraphicFramePr>
+            <a:graphic>
+              <a:graphicData uri="http://schemas.openxmlformats.org/drawingml/2006/picture">
+                <pic:pic>
+                  <pic:nvPicPr>
+                    <pic:cNvPr id="0" name="EventKu - Tugas Bambang 5803024019 - Paket Lengkap (Satu Dokumen) - 12 _ Algoritma pencarian dan filter.png"/>
+                    <pic:cNvPicPr/>
+                  </pic:nvPicPr>
+                  <pic:blipFill>
+                    <a:blip r:embed="rId20"/>
+                    <a:srcRect l="6944" t="20045" r="10119" b="26564"/>
+                    <a:stretch>
+                      <a:fillRect/>
+                    </a:stretch>
+                  </pic:blipFill>
+                  <pic:spPr>
+                    <a:xfrm>
+                      <a:off x="0" y="0"/>
+                      <a:ext cx="6035040" cy="4114800"/>
+                    </a:xfrm>
+                    <a:prstGeom prst="rect"/>
+                  </pic:spPr>
+                </pic:pic>
+              </a:graphicData>
+            </a:graphic>
+          </wp:inline>
+        </w:drawing>
+      </w:r>
+    </w:p>
+    <w:p>
+      <w:pPr>
+        <w:keepNext w:val="0"/>
+        <w:pageBreakBefore w:val="0"/>
+        <w:spacing w:before="40" w:after="160"/>
+        <w:jc w:val="center"/>
+      </w:pPr>
+      <w:r>
+        <w:rPr>
+          <w:rFonts w:ascii="Calibri" w:hAnsi="Calibri"/>
+          <w:i/>
+          <w:sz w:val="20"/>
+        </w:rPr>
+        <w:t>Gambar 7. Algoritma Pencarian dan Filter Event (ekspor Lucidchart)</w:t>
+      </w:r>
+    </w:p>
+    <w:p>
+      <w:pPr>
+        <w:keepNext/>
+        <w:keepLines/>
+        <w:pageBreakBefore w:val="0"/>
         <w:spacing w:after="160" w:before="320"/>
       </w:pPr>
       <w:r>
@@ -917,7 +1643,7 @@
           <w:sz w:val="30"/>
           <w:szCs w:val="30"/>
         </w:rPr>
-        <w:t xml:space="preserve">3. Class Diagram per Modul</w:t>
+        <w:t xml:space="preserve">5. Kontrak API Awal (Endpoint Utama)</w:t>
       </w:r>
     </w:p>
     <w:p>
@@ -930,588 +1656,13 @@
           <w:sz w:val="22"/>
           <w:szCs w:val="22"/>
         </w:rPr>
-        <w:t xml:space="preserve">Class diagram berikut disusun untuk keempat modul, memuat struktur data (atribut entitas) serta algoritma/perilaku inti (method) pada lapisan controller, service, dan repository. Notasi: kotak biru tua = controller/service, kotak hijau «interface» = repository, kotak oranye = kontrak lintas modul (facade), kotak emas = komponen shared kernel/infrastruktur.</w:t>
-      </w:r>
-    </w:p>
-    <w:p>
-      <w:pPr>
-        <w:spacing w:after="160" w:before="320"/>
-      </w:pPr>
-      <w:r>
-        <w:rPr>
-          <w:rFonts w:ascii="Calibri" w:cs="Calibri" w:eastAsia="Calibri" w:hAnsi="Calibri"/>
-          <w:b/>
-          <w:bCs/>
-          <w:color w:val="1F3864"/>
-          <w:sz w:val="25"/>
-          <w:szCs w:val="25"/>
-        </w:rPr>
-        <w:t xml:space="preserve">3.1 Modul Auth</w:t>
-      </w:r>
-    </w:p>
-    <w:p>
-      <w:pPr>
-        <w:spacing w:after="160" w:before="80"/>
-        <w:jc w:val="center"/>
-      </w:pPr>
-      <w:r>
-        <w:drawing>
-          <wp:inline distT="0" distB="0" distL="0" distR="0">
-            <wp:extent cx="5486400" cy="3808473"/>
-            <wp:effectExtent t="0" r="0" b="0" l="0"/>
-            <wp:docPr id="1" name="" descr="" title=""/>
-            <wp:cNvGraphicFramePr>
-              <a:graphicFrameLocks xmlns:a="http://schemas.openxmlformats.org/drawingml/2006/main" noChangeAspect="1"/>
-            </wp:cNvGraphicFramePr>
-            <a:graphic xmlns:a="http://schemas.openxmlformats.org/drawingml/2006/main">
-              <a:graphicData uri="http://schemas.openxmlformats.org/drawingml/2006/picture">
-                <pic:pic xmlns:pic="http://schemas.openxmlformats.org/drawingml/2006/picture">
-                  <pic:nvPicPr>
-                    <pic:cNvPr id="0" name="" descr=""/>
-                    <pic:cNvPicPr>
-                      <a:picLocks noChangeAspect="1" noChangeArrowheads="1"/>
-                    </pic:cNvPicPr>
-                  </pic:nvPicPr>
-                  <pic:blipFill>
-                    <a:blip r:embed="rId8" cstate="none"/>
-                    <a:srcRect/>
-                    <a:stretch>
-                      <a:fillRect/>
-                    </a:stretch>
-                  </pic:blipFill>
-                  <pic:spPr bwMode="auto">
-                    <a:xfrm>
-                      <a:off x="0" y="0"/>
-                      <a:ext cx="5486400" cy="3808473"/>
-                    </a:xfrm>
-                    <a:prstGeom prst="rect">
-                      <a:avLst/>
-                    </a:prstGeom>
-                  </pic:spPr>
-                </pic:pic>
-              </a:graphicData>
-            </a:graphic>
-          </wp:inline>
-        </w:drawing>
-      </w:r>
-    </w:p>
-    <w:p>
-      <w:pPr>
-        <w:spacing w:after="260"/>
-        <w:jc w:val="center"/>
-      </w:pPr>
-      <w:r>
-        <w:rPr>
-          <w:rFonts w:ascii="Calibri" w:cs="Calibri" w:eastAsia="Calibri" w:hAnsi="Calibri"/>
-          <w:i/>
-          <w:iCs/>
-          <w:color w:val="555555"/>
-          <w:sz w:val="18"/>
-          <w:szCs w:val="18"/>
-        </w:rPr>
-        <w:t xml:space="preserve">Gambar 2. Class Diagram Modul Auth</w:t>
-      </w:r>
-    </w:p>
-    <w:p>
-      <w:pPr>
-        <w:spacing w:after="120" w:before="0"/>
-      </w:pPr>
-      <w:r>
-        <w:rPr>
-          <w:rFonts w:ascii="Calibri" w:cs="Calibri" w:eastAsia="Calibri" w:hAnsi="Calibri"/>
-          <w:sz w:val="22"/>
-          <w:szCs w:val="22"/>
-        </w:rPr>
-        <w:t xml:space="preserve">Algoritma inti: AuthService.authenticate melakukan verifikasi password ter-hash (bcrypt) terhadap email yang dicari lewat UserRepository.findByEmail, kemudian JwtProvider.sign menghasilkan token berisi userId dan role untuk dipakai RoleGuard pada permintaan berikutnya (mendukung US-AUTH-03, US-AUTH-05).</w:t>
-      </w:r>
-    </w:p>
-    <w:p>
-      <w:pPr>
-        <w:spacing w:after="160" w:before="320"/>
-      </w:pPr>
-      <w:r>
-        <w:rPr>
-          <w:rFonts w:ascii="Calibri" w:cs="Calibri" w:eastAsia="Calibri" w:hAnsi="Calibri"/>
-          <w:b/>
-          <w:bCs/>
-          <w:color w:val="1F3864"/>
-          <w:sz w:val="25"/>
-          <w:szCs w:val="25"/>
-        </w:rPr>
-        <w:t xml:space="preserve">3.2 Modul Event</w:t>
-      </w:r>
-    </w:p>
-    <w:p>
-      <w:pPr>
-        <w:spacing w:after="160" w:before="80"/>
-        <w:jc w:val="center"/>
-      </w:pPr>
-      <w:r>
-        <w:drawing>
-          <wp:inline distT="0" distB="0" distL="0" distR="0">
-            <wp:extent cx="5760720" cy="4778027"/>
-            <wp:effectExtent t="0" r="0" b="0" l="0"/>
-            <wp:docPr id="1" name="" descr="" title=""/>
-            <wp:cNvGraphicFramePr>
-              <a:graphicFrameLocks xmlns:a="http://schemas.openxmlformats.org/drawingml/2006/main" noChangeAspect="1"/>
-            </wp:cNvGraphicFramePr>
-            <a:graphic xmlns:a="http://schemas.openxmlformats.org/drawingml/2006/main">
-              <a:graphicData uri="http://schemas.openxmlformats.org/drawingml/2006/picture">
-                <pic:pic xmlns:pic="http://schemas.openxmlformats.org/drawingml/2006/picture">
-                  <pic:nvPicPr>
-                    <pic:cNvPr id="0" name="" descr=""/>
-                    <pic:cNvPicPr>
-                      <a:picLocks noChangeAspect="1" noChangeArrowheads="1"/>
-                    </pic:cNvPicPr>
-                  </pic:nvPicPr>
-                  <pic:blipFill>
-                    <a:blip r:embed="rId9" cstate="none"/>
-                    <a:srcRect/>
-                    <a:stretch>
-                      <a:fillRect/>
-                    </a:stretch>
-                  </pic:blipFill>
-                  <pic:spPr bwMode="auto">
-                    <a:xfrm>
-                      <a:off x="0" y="0"/>
-                      <a:ext cx="5760720" cy="4778027"/>
-                    </a:xfrm>
-                    <a:prstGeom prst="rect">
-                      <a:avLst/>
-                    </a:prstGeom>
-                  </pic:spPr>
-                </pic:pic>
-              </a:graphicData>
-            </a:graphic>
-          </wp:inline>
-        </w:drawing>
-      </w:r>
-    </w:p>
-    <w:p>
-      <w:pPr>
-        <w:spacing w:after="260"/>
-        <w:jc w:val="center"/>
-      </w:pPr>
-      <w:r>
-        <w:rPr>
-          <w:rFonts w:ascii="Calibri" w:cs="Calibri" w:eastAsia="Calibri" w:hAnsi="Calibri"/>
-          <w:i/>
-          <w:iCs/>
-          <w:color w:val="555555"/>
-          <w:sz w:val="18"/>
-          <w:szCs w:val="18"/>
-        </w:rPr>
-        <w:t xml:space="preserve">Gambar 3. Class Diagram Modul Event</w:t>
-      </w:r>
-    </w:p>
-    <w:p>
-      <w:pPr>
-        <w:spacing w:after="120" w:before="0"/>
-      </w:pPr>
-      <w:r>
-        <w:rPr>
-          <w:rFonts w:ascii="Calibri" w:cs="Calibri" w:eastAsia="Calibri" w:hAnsi="Calibri"/>
-          <w:sz w:val="22"/>
-          <w:szCs w:val="22"/>
-        </w:rPr>
-        <w:t xml:space="preserve">Algoritma inti: EventService.searchEvents menerapkan algoritma filter/pencarian berdasarkan kombinasi kategori, rentang tanggal, penyelenggara, dan kata kunci judul, lalu menerapkan pagination (default 20 data/halaman sesuai NFR-PERF-02) sebelum mengembalikan hasil ke EventController (mendukung US-EVENT-05). Transisi status event (diajukan → disetujui/ditolak → selesai) hanya dapat dilakukan melalui method approve()/reject() pada entitas Event yang dipanggil dari EventService, sesuai aturan bisnis pada ERD Minggu 5.</w:t>
-      </w:r>
-    </w:p>
-    <w:p>
-      <w:pPr>
-        <w:spacing w:after="160" w:before="320"/>
-      </w:pPr>
-      <w:r>
-        <w:rPr>
-          <w:rFonts w:ascii="Calibri" w:cs="Calibri" w:eastAsia="Calibri" w:hAnsi="Calibri"/>
-          <w:b/>
-          <w:bCs/>
-          <w:color w:val="1F3864"/>
-          <w:sz w:val="25"/>
-          <w:szCs w:val="25"/>
-        </w:rPr>
-        <w:t xml:space="preserve">3.3 Modul Pendaftaran / RSVP</w:t>
-      </w:r>
-    </w:p>
-    <w:p>
-      <w:pPr>
-        <w:spacing w:after="160" w:before="80"/>
-        <w:jc w:val="center"/>
-      </w:pPr>
-      <w:r>
-        <w:drawing>
-          <wp:inline distT="0" distB="0" distL="0" distR="0">
-            <wp:extent cx="5486400" cy="3740586"/>
-            <wp:effectExtent t="0" r="0" b="0" l="0"/>
-            <wp:docPr id="1" name="" descr="" title=""/>
-            <wp:cNvGraphicFramePr>
-              <a:graphicFrameLocks xmlns:a="http://schemas.openxmlformats.org/drawingml/2006/main" noChangeAspect="1"/>
-            </wp:cNvGraphicFramePr>
-            <a:graphic xmlns:a="http://schemas.openxmlformats.org/drawingml/2006/main">
-              <a:graphicData uri="http://schemas.openxmlformats.org/drawingml/2006/picture">
-                <pic:pic xmlns:pic="http://schemas.openxmlformats.org/drawingml/2006/picture">
-                  <pic:nvPicPr>
-                    <pic:cNvPr id="0" name="" descr=""/>
-                    <pic:cNvPicPr>
-                      <a:picLocks noChangeAspect="1" noChangeArrowheads="1"/>
-                    </pic:cNvPicPr>
-                  </pic:nvPicPr>
-                  <pic:blipFill>
-                    <a:blip r:embed="rId10" cstate="none"/>
-                    <a:srcRect/>
-                    <a:stretch>
-                      <a:fillRect/>
-                    </a:stretch>
-                  </pic:blipFill>
-                  <pic:spPr bwMode="auto">
-                    <a:xfrm>
-                      <a:off x="0" y="0"/>
-                      <a:ext cx="5486400" cy="3740586"/>
-                    </a:xfrm>
-                    <a:prstGeom prst="rect">
-                      <a:avLst/>
-                    </a:prstGeom>
-                  </pic:spPr>
-                </pic:pic>
-              </a:graphicData>
-            </a:graphic>
-          </wp:inline>
-        </w:drawing>
-      </w:r>
-    </w:p>
-    <w:p>
-      <w:pPr>
-        <w:spacing w:after="260"/>
-        <w:jc w:val="center"/>
-      </w:pPr>
-      <w:r>
-        <w:rPr>
-          <w:rFonts w:ascii="Calibri" w:cs="Calibri" w:eastAsia="Calibri" w:hAnsi="Calibri"/>
-          <w:i/>
-          <w:iCs/>
-          <w:color w:val="555555"/>
-          <w:sz w:val="18"/>
-          <w:szCs w:val="18"/>
-        </w:rPr>
-        <w:t xml:space="preserve">Gambar 4. Class Diagram Modul Pendaftaran/RSVP</w:t>
-      </w:r>
-    </w:p>
-    <w:p>
-      <w:pPr>
-        <w:spacing w:after="120" w:before="0"/>
-      </w:pPr>
-      <w:r>
-        <w:rPr>
-          <w:rFonts w:ascii="Calibri" w:cs="Calibri" w:eastAsia="Calibri" w:hAnsi="Calibri"/>
-          <w:sz w:val="22"/>
-          <w:szCs w:val="22"/>
-        </w:rPr>
-        <w:t xml:space="preserve">Algoritma inti: RegistrationService.registerStudent memanggil EventPublicApi.reserveSeat(eventId) sebelum menyimpan Registration baru, sehingga validasi kuota (quota vs. countActive) tetap menjadi tanggung jawab modul Event walau dipicu dari modul Pendaftaran — menjaga batas modul sesuai keputusan arsitektur Minggu 2.</w:t>
-      </w:r>
-    </w:p>
-    <w:p>
-      <w:pPr>
-        <w:spacing w:after="160" w:before="320"/>
-      </w:pPr>
-      <w:r>
-        <w:rPr>
-          <w:rFonts w:ascii="Calibri" w:cs="Calibri" w:eastAsia="Calibri" w:hAnsi="Calibri"/>
-          <w:b/>
-          <w:bCs/>
-          <w:color w:val="1F3864"/>
-          <w:sz w:val="25"/>
-          <w:szCs w:val="25"/>
-        </w:rPr>
-        <w:t xml:space="preserve">3.4 Modul Notifikasi</w:t>
-      </w:r>
-    </w:p>
-    <w:p>
-      <w:pPr>
-        <w:spacing w:after="160" w:before="80"/>
-        <w:jc w:val="center"/>
-      </w:pPr>
-      <w:r>
-        <w:drawing>
-          <wp:inline distT="0" distB="0" distL="0" distR="0">
-            <wp:extent cx="5486400" cy="3740586"/>
-            <wp:effectExtent t="0" r="0" b="0" l="0"/>
-            <wp:docPr id="1" name="" descr="" title=""/>
-            <wp:cNvGraphicFramePr>
-              <a:graphicFrameLocks xmlns:a="http://schemas.openxmlformats.org/drawingml/2006/main" noChangeAspect="1"/>
-            </wp:cNvGraphicFramePr>
-            <a:graphic xmlns:a="http://schemas.openxmlformats.org/drawingml/2006/main">
-              <a:graphicData uri="http://schemas.openxmlformats.org/drawingml/2006/picture">
-                <pic:pic xmlns:pic="http://schemas.openxmlformats.org/drawingml/2006/picture">
-                  <pic:nvPicPr>
-                    <pic:cNvPr id="0" name="" descr=""/>
-                    <pic:cNvPicPr>
-                      <a:picLocks noChangeAspect="1" noChangeArrowheads="1"/>
-                    </pic:cNvPicPr>
-                  </pic:nvPicPr>
-                  <pic:blipFill>
-                    <a:blip r:embed="rId11" cstate="none"/>
-                    <a:srcRect/>
-                    <a:stretch>
-                      <a:fillRect/>
-                    </a:stretch>
-                  </pic:blipFill>
-                  <pic:spPr bwMode="auto">
-                    <a:xfrm>
-                      <a:off x="0" y="0"/>
-                      <a:ext cx="5486400" cy="3740586"/>
-                    </a:xfrm>
-                    <a:prstGeom prst="rect">
-                      <a:avLst/>
-                    </a:prstGeom>
-                  </pic:spPr>
-                </pic:pic>
-              </a:graphicData>
-            </a:graphic>
-          </wp:inline>
-        </w:drawing>
-      </w:r>
-    </w:p>
-    <w:p>
-      <w:pPr>
-        <w:spacing w:after="260"/>
-        <w:jc w:val="center"/>
-      </w:pPr>
-      <w:r>
-        <w:rPr>
-          <w:rFonts w:ascii="Calibri" w:cs="Calibri" w:eastAsia="Calibri" w:hAnsi="Calibri"/>
-          <w:i/>
-          <w:iCs/>
-          <w:color w:val="555555"/>
-          <w:sz w:val="18"/>
-          <w:szCs w:val="18"/>
-        </w:rPr>
-        <w:t xml:space="preserve">Gambar 5. Class Diagram Modul Notifikasi</w:t>
-      </w:r>
-    </w:p>
-    <w:p>
-      <w:pPr>
-        <w:spacing w:after="120" w:before="0"/>
-      </w:pPr>
-      <w:r>
-        <w:rPr>
-          <w:rFonts w:ascii="Calibri" w:cs="Calibri" w:eastAsia="Calibri" w:hAnsi="Calibri"/>
-          <w:sz w:val="22"/>
-          <w:szCs w:val="22"/>
-        </w:rPr>
-        <w:t xml:space="preserve">Algoritma inti: NotificationService.onEventApproved dan onStudentRegistered merupakan handler yang didaftarkan ke EventBus.subscribe saat aplikasi start-up; keduanya membuat entri Notification baru tanpa modul Event atau Pendaftaran memanggil modul Notifikasi secara langsung (US-EVENT-06, NFR-MOD-04).</w:t>
-      </w:r>
-    </w:p>
-    <w:p>
-      <w:pPr>
-        <w:spacing w:after="160" w:before="320"/>
-      </w:pPr>
-      <w:r>
-        <w:rPr>
-          <w:rFonts w:ascii="Calibri" w:cs="Calibri" w:eastAsia="Calibri" w:hAnsi="Calibri"/>
-          <w:b/>
-          <w:bCs/>
-          <w:color w:val="1F3864"/>
-          <w:sz w:val="30"/>
-          <w:szCs w:val="30"/>
-        </w:rPr>
-        <w:t xml:space="preserve">4. ERD Final</w:t>
-      </w:r>
-    </w:p>
-    <w:p>
-      <w:pPr>
-        <w:spacing w:after="120" w:before="0"/>
-      </w:pPr>
-      <w:r>
-        <w:rPr>
-          <w:rFonts w:ascii="Calibri" w:cs="Calibri" w:eastAsia="Calibri" w:hAnsi="Calibri"/>
-          <w:sz w:val="22"/>
-          <w:szCs w:val="22"/>
-        </w:rPr>
-        <w:t xml:space="preserve">ERD final menyelaraskan draft ERD v1 (Minggu 5, modul Auth &amp; Event) dengan entitas modul Pendaftaran/RSVP dan Notifikasi yang disusun Audrey Gresia dan Alexa pada Minggu 3, sesuai rencana pada catatan Minggu 5. Entitas Registration dan Notification/CategorySubscription ditambahkan tanpa mengubah struktur User, EventCategory, dan Event yang sudah difinalkan sebelumnya.</w:t>
-      </w:r>
-    </w:p>
-    <w:p>
-      <w:pPr>
-        <w:spacing w:after="160" w:before="80"/>
-        <w:jc w:val="center"/>
-      </w:pPr>
-      <w:r>
-        <w:drawing>
-          <wp:inline distT="0" distB="0" distL="0" distR="0">
-            <wp:extent cx="5943600" cy="4503410"/>
-            <wp:effectExtent t="0" r="0" b="0" l="0"/>
-            <wp:docPr id="1" name="" descr="" title=""/>
-            <wp:cNvGraphicFramePr>
-              <a:graphicFrameLocks xmlns:a="http://schemas.openxmlformats.org/drawingml/2006/main" noChangeAspect="1"/>
-            </wp:cNvGraphicFramePr>
-            <a:graphic xmlns:a="http://schemas.openxmlformats.org/drawingml/2006/main">
-              <a:graphicData uri="http://schemas.openxmlformats.org/drawingml/2006/picture">
-                <pic:pic xmlns:pic="http://schemas.openxmlformats.org/drawingml/2006/picture">
-                  <pic:nvPicPr>
-                    <pic:cNvPr id="0" name="" descr=""/>
-                    <pic:cNvPicPr>
-                      <a:picLocks noChangeAspect="1" noChangeArrowheads="1"/>
-                    </pic:cNvPicPr>
-                  </pic:nvPicPr>
-                  <pic:blipFill>
-                    <a:blip r:embed="rId12" cstate="none"/>
-                    <a:srcRect/>
-                    <a:stretch>
-                      <a:fillRect/>
-                    </a:stretch>
-                  </pic:blipFill>
-                  <pic:spPr bwMode="auto">
-                    <a:xfrm>
-                      <a:off x="0" y="0"/>
-                      <a:ext cx="5943600" cy="4503410"/>
-                    </a:xfrm>
-                    <a:prstGeom prst="rect">
-                      <a:avLst/>
-                    </a:prstGeom>
-                  </pic:spPr>
-                </pic:pic>
-              </a:graphicData>
-            </a:graphic>
-          </wp:inline>
-        </w:drawing>
-      </w:r>
-    </w:p>
-    <w:p>
-      <w:pPr>
-        <w:spacing w:after="260"/>
-        <w:jc w:val="center"/>
-      </w:pPr>
-      <w:r>
-        <w:rPr>
-          <w:rFonts w:ascii="Calibri" w:cs="Calibri" w:eastAsia="Calibri" w:hAnsi="Calibri"/>
-          <w:i/>
-          <w:iCs/>
-          <w:color w:val="555555"/>
-          <w:sz w:val="18"/>
-          <w:szCs w:val="18"/>
-        </w:rPr>
-        <w:t xml:space="preserve">Gambar 6. ERD Final EventKu — Modul Auth, Event, Pendaftaran/RSVP, Notifikasi</w:t>
-      </w:r>
-    </w:p>
-    <w:p>
-      <w:pPr>
-        <w:spacing w:after="160" w:before="320"/>
-      </w:pPr>
-      <w:r>
-        <w:rPr>
-          <w:rFonts w:ascii="Calibri" w:cs="Calibri" w:eastAsia="Calibri" w:hAnsi="Calibri"/>
-          <w:b/>
-          <w:bCs/>
-          <w:color w:val="1F3864"/>
-          <w:sz w:val="25"/>
-          <w:szCs w:val="25"/>
-        </w:rPr>
-        <w:t xml:space="preserve">4.1 Entitas &amp; Relasi Tambahan</w:t>
-      </w:r>
-    </w:p>
-    <w:p>
-      <w:pPr>
-        <w:pStyle w:val="ListParagraph"/>
-        <w:numPr>
-          <w:ilvl w:val="0"/>
-          <w:numId w:val="1"/>
-        </w:numPr>
-        <w:spacing w:after="100"/>
-      </w:pPr>
-      <w:r>
-        <w:rPr>
-          <w:rFonts w:ascii="Calibri" w:cs="Calibri" w:eastAsia="Calibri" w:hAnsi="Calibri"/>
-          <w:sz w:val="21"/>
-          <w:szCs w:val="21"/>
-        </w:rPr>
-        <w:t xml:space="preserve">Registration — mencatat pendaftaran mahasiswa pada sebuah event (relasi Event 1:N Registration, User 1:N Registration); status aktif/dibatalkan mendukung pembatalan RSVP tanpa menghapus riwayat.</w:t>
-      </w:r>
-    </w:p>
-    <w:p>
-      <w:pPr>
-        <w:pStyle w:val="ListParagraph"/>
-        <w:numPr>
-          <w:ilvl w:val="0"/>
-          <w:numId w:val="1"/>
-        </w:numPr>
-        <w:spacing w:after="100"/>
-      </w:pPr>
-      <w:r>
-        <w:rPr>
-          <w:rFonts w:ascii="Calibri" w:cs="Calibri" w:eastAsia="Calibri" w:hAnsi="Calibri"/>
-          <w:sz w:val="21"/>
-          <w:szCs w:val="21"/>
-        </w:rPr>
-        <w:t xml:space="preserve">Notification — mencatat notifikasi yang dikirim ke seorang pengguna terkait sebuah event (relasi User 1:N Notification, Event 1:N Notification), dipicu oleh EventBus saat status event berubah atau pendaftaran baru terjadi.</w:t>
-      </w:r>
-    </w:p>
-    <w:p>
-      <w:pPr>
-        <w:pStyle w:val="ListParagraph"/>
-        <w:numPr>
-          <w:ilvl w:val="0"/>
-          <w:numId w:val="1"/>
-        </w:numPr>
-        <w:spacing w:after="100"/>
-      </w:pPr>
-      <w:r>
-        <w:rPr>
-          <w:rFonts w:ascii="Calibri" w:cs="Calibri" w:eastAsia="Calibri" w:hAnsi="Calibri"/>
-          <w:sz w:val="21"/>
-          <w:szCs w:val="21"/>
-        </w:rPr>
-        <w:t xml:space="preserve">CategorySubscription — mencatat kategori event yang diminati seorang mahasiswa (relasi User 1:N CategorySubscription, EventCategory 1:N CategorySubscription), menjadi dasar penentuan target notifikasi "event baru sesuai minat".</w:t>
-      </w:r>
-    </w:p>
-    <w:p>
-      <w:pPr>
-        <w:pStyle w:val="ListParagraph"/>
-        <w:numPr>
-          <w:ilvl w:val="0"/>
-          <w:numId w:val="1"/>
-        </w:numPr>
-        <w:spacing w:after="100"/>
-      </w:pPr>
-      <w:r>
-        <w:rPr>
-          <w:rFonts w:ascii="Calibri" w:cs="Calibri" w:eastAsia="Calibri" w:hAnsi="Calibri"/>
-          <w:sz w:val="21"/>
-          <w:szCs w:val="21"/>
-        </w:rPr>
-        <w:t xml:space="preserve">Seluruh relasi baru bersifat wajib (mandatory) kecuali moderated_by pada Event yang tetap opsional sampai event diproses admin, mengikuti aturan bisnis ERD Minggu 5.</w:t>
-      </w:r>
-    </w:p>
-    <w:p>
-      <w:pPr>
-        <w:spacing w:after="160" w:before="320"/>
-      </w:pPr>
-      <w:r>
-        <w:rPr>
-          <w:rFonts w:ascii="Calibri" w:cs="Calibri" w:eastAsia="Calibri" w:hAnsi="Calibri"/>
-          <w:b/>
-          <w:bCs/>
-          <w:color w:val="1F3864"/>
-          <w:sz w:val="30"/>
-          <w:szCs w:val="30"/>
-        </w:rPr>
-        <w:t xml:space="preserve">5. Kontrak API Awal (Endpoint Utama)</w:t>
-      </w:r>
-    </w:p>
-    <w:p>
-      <w:pPr>
-        <w:spacing w:after="120" w:before="0"/>
-      </w:pPr>
-      <w:r>
-        <w:rPr>
-          <w:rFonts w:ascii="Calibri" w:cs="Calibri" w:eastAsia="Calibri" w:hAnsi="Calibri"/>
-          <w:sz w:val="22"/>
-          <w:szCs w:val="22"/>
-        </w:rPr>
         <w:t xml:space="preserve">Kontrak API berikut mendefinisikan endpoint utama antar frontend-backend untuk keempat modul, sebagai acuan bagi pengembangan Sprint 1–3 (Minggu 10–13) dan dokumentasi lanjutan di koleksi Postman (NFR-MOD-03). Base path: /api/v1. Semua endpoint bertanda (Auth) memerlukan header Authorization: Bearer &lt;token&gt;; kolom Peran menandai role yang diizinkan mengakses endpoint tersebut.</w:t>
       </w:r>
     </w:p>
     <w:p>
       <w:pPr>
+        <w:keepNext/>
+        <w:keepLines/>
         <w:spacing w:after="160" w:before="320"/>
       </w:pPr>
       <w:r>
@@ -1548,6 +1699,7 @@
       <w:tr>
         <w:trPr>
           <w:tblHeader/>
+          <w:cantSplit/>
         </w:trPr>
         <w:tc>
           <w:tcPr>
@@ -1681,6 +1833,9 @@
         </w:tc>
       </w:tr>
       <w:tr>
+        <w:trPr>
+          <w:cantSplit/>
+        </w:trPr>
         <w:tc>
           <w:tcPr>
             <w:tcW w:type="pct" w:w="22%"/>
@@ -1698,7 +1853,7 @@
                 <w:rFonts w:ascii="Calibri" w:cs="Calibri" w:eastAsia="Calibri" w:hAnsi="Calibri"/>
                 <w:b/>
                 <w:bCs/>
-                <w:sz w:val="19"/>
+                <w:sz w:val="20"/>
                 <w:szCs w:val="19"/>
               </w:rPr>
               <w:t xml:space="preserve">POST /auth/register</w:t>
@@ -1720,7 +1875,7 @@
             <w:r>
               <w:rPr>
                 <w:rFonts w:ascii="Calibri" w:cs="Calibri" w:eastAsia="Calibri" w:hAnsi="Calibri"/>
-                <w:sz w:val="19"/>
+                <w:sz w:val="20"/>
                 <w:szCs w:val="19"/>
               </w:rPr>
               <w:t xml:space="preserve">Publik</w:t>
@@ -1742,7 +1897,7 @@
             <w:r>
               <w:rPr>
                 <w:rFonts w:ascii="Calibri" w:cs="Calibri" w:eastAsia="Calibri" w:hAnsi="Calibri"/>
-                <w:sz w:val="19"/>
+                <w:sz w:val="20"/>
                 <w:szCs w:val="19"/>
               </w:rPr>
               <w:t xml:space="preserve">Registrasi akun baru (mahasiswa/penyelenggara)</w:t>
@@ -1767,7 +1922,7 @@
                 <w:i/>
                 <w:iCs/>
                 <w:color w:val="555555"/>
-                <w:sz w:val="19"/>
+                <w:sz w:val="20"/>
                 <w:szCs w:val="19"/>
               </w:rPr>
               <w:t xml:space="preserve">{ name, email, password, role }</w:t>
@@ -1792,7 +1947,7 @@
                 <w:i/>
                 <w:iCs/>
                 <w:color w:val="555555"/>
-                <w:sz w:val="19"/>
+                <w:sz w:val="20"/>
                 <w:szCs w:val="19"/>
               </w:rPr>
               <w:t xml:space="preserve">201 { userId, name, email, role }</w:t>
@@ -1801,6 +1956,9 @@
         </w:tc>
       </w:tr>
       <w:tr>
+        <w:trPr>
+          <w:cantSplit/>
+        </w:trPr>
         <w:tc>
           <w:tcPr>
             <w:tcW w:type="pct" w:w="22%"/>
@@ -1818,7 +1976,7 @@
                 <w:rFonts w:ascii="Calibri" w:cs="Calibri" w:eastAsia="Calibri" w:hAnsi="Calibri"/>
                 <w:b/>
                 <w:bCs/>
-                <w:sz w:val="19"/>
+                <w:sz w:val="20"/>
                 <w:szCs w:val="19"/>
               </w:rPr>
               <w:t xml:space="preserve">POST /auth/login</w:t>
@@ -1840,7 +1998,7 @@
             <w:r>
               <w:rPr>
                 <w:rFonts w:ascii="Calibri" w:cs="Calibri" w:eastAsia="Calibri" w:hAnsi="Calibri"/>
-                <w:sz w:val="19"/>
+                <w:sz w:val="20"/>
                 <w:szCs w:val="19"/>
               </w:rPr>
               <w:t xml:space="preserve">Publik</w:t>
@@ -1862,7 +2020,7 @@
             <w:r>
               <w:rPr>
                 <w:rFonts w:ascii="Calibri" w:cs="Calibri" w:eastAsia="Calibri" w:hAnsi="Calibri"/>
-                <w:sz w:val="19"/>
+                <w:sz w:val="20"/>
                 <w:szCs w:val="19"/>
               </w:rPr>
               <w:t xml:space="preserve">Login &amp; menerbitkan token akses</w:t>
@@ -1887,7 +2045,7 @@
                 <w:i/>
                 <w:iCs/>
                 <w:color w:val="555555"/>
-                <w:sz w:val="19"/>
+                <w:sz w:val="20"/>
                 <w:szCs w:val="19"/>
               </w:rPr>
               <w:t xml:space="preserve">{ email, password }</w:t>
@@ -1912,7 +2070,7 @@
                 <w:i/>
                 <w:iCs/>
                 <w:color w:val="555555"/>
-                <w:sz w:val="19"/>
+                <w:sz w:val="20"/>
                 <w:szCs w:val="19"/>
               </w:rPr>
               <w:t xml:space="preserve">200 { accessToken, user }</w:t>
@@ -1921,6 +2079,9 @@
         </w:tc>
       </w:tr>
       <w:tr>
+        <w:trPr>
+          <w:cantSplit/>
+        </w:trPr>
         <w:tc>
           <w:tcPr>
             <w:tcW w:type="pct" w:w="22%"/>
@@ -1938,7 +2099,7 @@
                 <w:rFonts w:ascii="Calibri" w:cs="Calibri" w:eastAsia="Calibri" w:hAnsi="Calibri"/>
                 <w:b/>
                 <w:bCs/>
-                <w:sz w:val="19"/>
+                <w:sz w:val="20"/>
                 <w:szCs w:val="19"/>
               </w:rPr>
               <w:t xml:space="preserve">GET /auth/me</w:t>
@@ -1960,7 +2121,7 @@
             <w:r>
               <w:rPr>
                 <w:rFonts w:ascii="Calibri" w:cs="Calibri" w:eastAsia="Calibri" w:hAnsi="Calibri"/>
-                <w:sz w:val="19"/>
+                <w:sz w:val="20"/>
                 <w:szCs w:val="19"/>
               </w:rPr>
               <w:t xml:space="preserve">Semua peran (Auth)</w:t>
@@ -1982,7 +2143,7 @@
             <w:r>
               <w:rPr>
                 <w:rFonts w:ascii="Calibri" w:cs="Calibri" w:eastAsia="Calibri" w:hAnsi="Calibri"/>
-                <w:sz w:val="19"/>
+                <w:sz w:val="20"/>
                 <w:szCs w:val="19"/>
               </w:rPr>
               <w:t xml:space="preserve">Mengambil profil pengguna yang sedang login</w:t>
@@ -2007,7 +2168,7 @@
                 <w:i/>
                 <w:iCs/>
                 <w:color w:val="555555"/>
-                <w:sz w:val="19"/>
+                <w:sz w:val="20"/>
                 <w:szCs w:val="19"/>
               </w:rPr>
               <w:t xml:space="preserve">— (dari token)</w:t>
@@ -2032,7 +2193,7 @@
                 <w:i/>
                 <w:iCs/>
                 <w:color w:val="555555"/>
-                <w:sz w:val="19"/>
+                <w:sz w:val="20"/>
                 <w:szCs w:val="19"/>
               </w:rPr>
               <w:t xml:space="preserve">200 { userId, name, email, role }</w:t>
@@ -2041,6 +2202,9 @@
         </w:tc>
       </w:tr>
       <w:tr>
+        <w:trPr>
+          <w:cantSplit/>
+        </w:trPr>
         <w:tc>
           <w:tcPr>
             <w:tcW w:type="pct" w:w="22%"/>
@@ -2058,7 +2222,7 @@
                 <w:rFonts w:ascii="Calibri" w:cs="Calibri" w:eastAsia="Calibri" w:hAnsi="Calibri"/>
                 <w:b/>
                 <w:bCs/>
-                <w:sz w:val="19"/>
+                <w:sz w:val="20"/>
                 <w:szCs w:val="19"/>
               </w:rPr>
               <w:t xml:space="preserve">POST /auth/password-reset</w:t>
@@ -2080,7 +2244,7 @@
             <w:r>
               <w:rPr>
                 <w:rFonts w:ascii="Calibri" w:cs="Calibri" w:eastAsia="Calibri" w:hAnsi="Calibri"/>
-                <w:sz w:val="19"/>
+                <w:sz w:val="20"/>
                 <w:szCs w:val="19"/>
               </w:rPr>
               <w:t xml:space="preserve">Publik</w:t>
@@ -2102,7 +2266,7 @@
             <w:r>
               <w:rPr>
                 <w:rFonts w:ascii="Calibri" w:cs="Calibri" w:eastAsia="Calibri" w:hAnsi="Calibri"/>
-                <w:sz w:val="19"/>
+                <w:sz w:val="20"/>
                 <w:szCs w:val="19"/>
               </w:rPr>
               <w:t xml:space="preserve">Meminta tautan reset kata sandi via email</w:t>
@@ -2127,7 +2291,7 @@
                 <w:i/>
                 <w:iCs/>
                 <w:color w:val="555555"/>
-                <w:sz w:val="19"/>
+                <w:sz w:val="20"/>
                 <w:szCs w:val="19"/>
               </w:rPr>
               <w:t xml:space="preserve">{ email }</w:t>
@@ -2152,7 +2316,7 @@
                 <w:i/>
                 <w:iCs/>
                 <w:color w:val="555555"/>
-                <w:sz w:val="19"/>
+                <w:sz w:val="20"/>
                 <w:szCs w:val="19"/>
               </w:rPr>
               <w:t xml:space="preserve">200 { message }</w:t>
@@ -2163,6 +2327,8 @@
     </w:tbl>
     <w:p>
       <w:pPr>
+        <w:keepNext/>
+        <w:keepLines/>
         <w:spacing w:after="160" w:before="320"/>
       </w:pPr>
       <w:r>
@@ -2199,6 +2365,7 @@
       <w:tr>
         <w:trPr>
           <w:tblHeader/>
+          <w:cantSplit/>
         </w:trPr>
         <w:tc>
           <w:tcPr>
@@ -2332,6 +2499,9 @@
         </w:tc>
       </w:tr>
       <w:tr>
+        <w:trPr>
+          <w:cantSplit/>
+        </w:trPr>
         <w:tc>
           <w:tcPr>
             <w:tcW w:type="pct" w:w="20%"/>
@@ -2349,7 +2519,7 @@
                 <w:rFonts w:ascii="Calibri" w:cs="Calibri" w:eastAsia="Calibri" w:hAnsi="Calibri"/>
                 <w:b/>
                 <w:bCs/>
-                <w:sz w:val="19"/>
+                <w:sz w:val="20"/>
                 <w:szCs w:val="19"/>
               </w:rPr>
               <w:t xml:space="preserve">POST /events</w:t>
@@ -2371,7 +2541,7 @@
             <w:r>
               <w:rPr>
                 <w:rFonts w:ascii="Calibri" w:cs="Calibri" w:eastAsia="Calibri" w:hAnsi="Calibri"/>
-                <w:sz w:val="19"/>
+                <w:sz w:val="20"/>
                 <w:szCs w:val="19"/>
               </w:rPr>
               <w:t xml:space="preserve">Penyelenggara (Auth)</w:t>
@@ -2393,7 +2563,7 @@
             <w:r>
               <w:rPr>
                 <w:rFonts w:ascii="Calibri" w:cs="Calibri" w:eastAsia="Calibri" w:hAnsi="Calibri"/>
-                <w:sz w:val="19"/>
+                <w:sz w:val="20"/>
                 <w:szCs w:val="19"/>
               </w:rPr>
               <w:t xml:space="preserve">Mengajukan event baru</w:t>
@@ -2418,7 +2588,7 @@
                 <w:i/>
                 <w:iCs/>
                 <w:color w:val="555555"/>
-                <w:sz w:val="19"/>
+                <w:sz w:val="20"/>
                 <w:szCs w:val="19"/>
               </w:rPr>
               <w:t xml:space="preserve">{ title, description, categoryId, dateTime, locationOrLink, posterUrl, quota }</w:t>
@@ -2443,7 +2613,7 @@
                 <w:i/>
                 <w:iCs/>
                 <w:color w:val="555555"/>
-                <w:sz w:val="19"/>
+                <w:sz w:val="20"/>
                 <w:szCs w:val="19"/>
               </w:rPr>
               <w:t xml:space="preserve">201 { eventId, status: "diajukan" }</w:t>
@@ -2452,6 +2622,9 @@
         </w:tc>
       </w:tr>
       <w:tr>
+        <w:trPr>
+          <w:cantSplit/>
+        </w:trPr>
         <w:tc>
           <w:tcPr>
             <w:tcW w:type="pct" w:w="20%"/>
@@ -2469,7 +2642,7 @@
                 <w:rFonts w:ascii="Calibri" w:cs="Calibri" w:eastAsia="Calibri" w:hAnsi="Calibri"/>
                 <w:b/>
                 <w:bCs/>
-                <w:sz w:val="19"/>
+                <w:sz w:val="20"/>
                 <w:szCs w:val="19"/>
               </w:rPr>
               <w:t xml:space="preserve">GET /events</w:t>
@@ -2491,10 +2664,10 @@
             <w:r>
               <w:rPr>
                 <w:rFonts w:ascii="Calibri" w:cs="Calibri" w:eastAsia="Calibri" w:hAnsi="Calibri"/>
-                <w:sz w:val="19"/>
-                <w:szCs w:val="19"/>
-              </w:rPr>
-              <w:t xml:space="preserve">Publik</w:t>
+                <w:sz w:val="20"/>
+                <w:szCs w:val="19"/>
+              </w:rPr>
+              <w:t>Publik / Penyelenggara (mine, Auth)</w:t>
             </w:r>
           </w:p>
         </w:tc>
@@ -2513,10 +2686,10 @@
             <w:r>
               <w:rPr>
                 <w:rFonts w:ascii="Calibri" w:cs="Calibri" w:eastAsia="Calibri" w:hAnsi="Calibri"/>
-                <w:sz w:val="19"/>
-                <w:szCs w:val="19"/>
-              </w:rPr>
-              <w:t xml:space="preserve">Mencari/memfilter event (kategori, tanggal, penyelenggara) dengan pagination</w:t>
+                <w:sz w:val="20"/>
+                <w:szCs w:val="19"/>
+              </w:rPr>
+              <w:t>Publik: event disetujui. mine=true: semua status milik penyelenggara login</w:t>
             </w:r>
           </w:p>
         </w:tc>
@@ -2538,10 +2711,10 @@
                 <w:i/>
                 <w:iCs/>
                 <w:color w:val="555555"/>
-                <w:sz w:val="19"/>
-                <w:szCs w:val="19"/>
-              </w:rPr>
-              <w:t xml:space="preserve">?category=&amp;date=&amp;organizer=&amp;page=&amp;limit=20</w:t>
+                <w:sz w:val="20"/>
+                <w:szCs w:val="19"/>
+              </w:rPr>
+              <w:t>?q=&amp;category=&amp;organizer=&amp;date= atau from=&amp;to=&amp;page=1&amp;limit=20</w:t>
             </w:r>
           </w:p>
         </w:tc>
@@ -2563,15 +2736,18 @@
                 <w:i/>
                 <w:iCs/>
                 <w:color w:val="555555"/>
-                <w:sz w:val="19"/>
-                <w:szCs w:val="19"/>
-              </w:rPr>
-              <w:t xml:space="preserve">200 { data: [...], page, total }</w:t>
+                <w:sz w:val="20"/>
+                <w:szCs w:val="19"/>
+              </w:rPr>
+              <w:t>200 { data: [...], page, total }</w:t>
             </w:r>
           </w:p>
         </w:tc>
       </w:tr>
       <w:tr>
+        <w:trPr>
+          <w:cantSplit/>
+        </w:trPr>
         <w:tc>
           <w:tcPr>
             <w:tcW w:type="pct" w:w="20%"/>
@@ -2589,7 +2765,7 @@
                 <w:rFonts w:ascii="Calibri" w:cs="Calibri" w:eastAsia="Calibri" w:hAnsi="Calibri"/>
                 <w:b/>
                 <w:bCs/>
-                <w:sz w:val="19"/>
+                <w:sz w:val="20"/>
                 <w:szCs w:val="19"/>
               </w:rPr>
               <w:t xml:space="preserve">GET /events/:id</w:t>
@@ -2611,7 +2787,7 @@
             <w:r>
               <w:rPr>
                 <w:rFonts w:ascii="Calibri" w:cs="Calibri" w:eastAsia="Calibri" w:hAnsi="Calibri"/>
-                <w:sz w:val="19"/>
+                <w:sz w:val="20"/>
                 <w:szCs w:val="19"/>
               </w:rPr>
               <w:t xml:space="preserve">Publik</w:t>
@@ -2633,7 +2809,7 @@
             <w:r>
               <w:rPr>
                 <w:rFonts w:ascii="Calibri" w:cs="Calibri" w:eastAsia="Calibri" w:hAnsi="Calibri"/>
-                <w:sz w:val="19"/>
+                <w:sz w:val="20"/>
                 <w:szCs w:val="19"/>
               </w:rPr>
               <w:t xml:space="preserve">Detail satu event</w:t>
@@ -2658,7 +2834,7 @@
                 <w:i/>
                 <w:iCs/>
                 <w:color w:val="555555"/>
-                <w:sz w:val="19"/>
+                <w:sz w:val="20"/>
                 <w:szCs w:val="19"/>
               </w:rPr>
               <w:t xml:space="preserve">—</w:t>
@@ -2683,7 +2859,7 @@
                 <w:i/>
                 <w:iCs/>
                 <w:color w:val="555555"/>
-                <w:sz w:val="19"/>
+                <w:sz w:val="20"/>
                 <w:szCs w:val="19"/>
               </w:rPr>
               <w:t xml:space="preserve">200 { event }</w:t>
@@ -2692,6 +2868,9 @@
         </w:tc>
       </w:tr>
       <w:tr>
+        <w:trPr>
+          <w:cantSplit/>
+        </w:trPr>
         <w:tc>
           <w:tcPr>
             <w:tcW w:type="pct" w:w="20%"/>
@@ -2709,7 +2888,7 @@
                 <w:rFonts w:ascii="Calibri" w:cs="Calibri" w:eastAsia="Calibri" w:hAnsi="Calibri"/>
                 <w:b/>
                 <w:bCs/>
-                <w:sz w:val="19"/>
+                <w:sz w:val="20"/>
                 <w:szCs w:val="19"/>
               </w:rPr>
               <w:t xml:space="preserve">PATCH /events/:id/moderate</w:t>
@@ -2731,7 +2910,7 @@
             <w:r>
               <w:rPr>
                 <w:rFonts w:ascii="Calibri" w:cs="Calibri" w:eastAsia="Calibri" w:hAnsi="Calibri"/>
-                <w:sz w:val="19"/>
+                <w:sz w:val="20"/>
                 <w:szCs w:val="19"/>
               </w:rPr>
               <w:t xml:space="preserve">Admin (Auth)</w:t>
@@ -2753,7 +2932,7 @@
             <w:r>
               <w:rPr>
                 <w:rFonts w:ascii="Calibri" w:cs="Calibri" w:eastAsia="Calibri" w:hAnsi="Calibri"/>
-                <w:sz w:val="19"/>
+                <w:sz w:val="20"/>
                 <w:szCs w:val="19"/>
               </w:rPr>
               <w:t xml:space="preserve">Menyetujui/menolak event</w:t>
@@ -2778,7 +2957,7 @@
                 <w:i/>
                 <w:iCs/>
                 <w:color w:val="555555"/>
-                <w:sz w:val="19"/>
+                <w:sz w:val="20"/>
                 <w:szCs w:val="19"/>
               </w:rPr>
               <w:t xml:space="preserve">{ decision: "disetujui"|"ditolak", alasan? }</w:t>
@@ -2803,7 +2982,7 @@
                 <w:i/>
                 <w:iCs/>
                 <w:color w:val="555555"/>
-                <w:sz w:val="19"/>
+                <w:sz w:val="20"/>
                 <w:szCs w:val="19"/>
               </w:rPr>
               <w:t xml:space="preserve">200 { eventId, status }</w:t>
@@ -2812,6 +2991,9 @@
         </w:tc>
       </w:tr>
       <w:tr>
+        <w:trPr>
+          <w:cantSplit/>
+        </w:trPr>
         <w:tc>
           <w:tcPr>
             <w:tcW w:type="pct" w:w="20%"/>
@@ -2829,7 +3011,7 @@
                 <w:rFonts w:ascii="Calibri" w:cs="Calibri" w:eastAsia="Calibri" w:hAnsi="Calibri"/>
                 <w:b/>
                 <w:bCs/>
-                <w:sz w:val="19"/>
+                <w:sz w:val="20"/>
                 <w:szCs w:val="19"/>
               </w:rPr>
               <w:t xml:space="preserve">PUT /events/:id</w:t>
@@ -2851,7 +3033,7 @@
             <w:r>
               <w:rPr>
                 <w:rFonts w:ascii="Calibri" w:cs="Calibri" w:eastAsia="Calibri" w:hAnsi="Calibri"/>
-                <w:sz w:val="19"/>
+                <w:sz w:val="20"/>
                 <w:szCs w:val="19"/>
               </w:rPr>
               <w:t xml:space="preserve">Penyelenggara pemilik (Auth)</w:t>
@@ -2873,10 +3055,10 @@
             <w:r>
               <w:rPr>
                 <w:rFonts w:ascii="Calibri" w:cs="Calibri" w:eastAsia="Calibri" w:hAnsi="Calibri"/>
-                <w:sz w:val="19"/>
-                <w:szCs w:val="19"/>
-              </w:rPr>
-              <w:t xml:space="preserve">Mengubah event miliknya (belum disetujui/berlangsung)</w:t>
+                <w:sz w:val="20"/>
+                <w:szCs w:val="19"/>
+              </w:rPr>
+              <w:t>Mengubah event milik sendiri berstatus diajukan/ditolak; ditolak diajukan ulang</w:t>
             </w:r>
           </w:p>
         </w:tc>
@@ -2898,7 +3080,7 @@
                 <w:i/>
                 <w:iCs/>
                 <w:color w:val="555555"/>
-                <w:sz w:val="19"/>
+                <w:sz w:val="20"/>
                 <w:szCs w:val="19"/>
               </w:rPr>
               <w:t xml:space="preserve">{ title?, description?, dateTime?, ... }</w:t>
@@ -2923,7 +3105,7 @@
                 <w:i/>
                 <w:iCs/>
                 <w:color w:val="555555"/>
-                <w:sz w:val="19"/>
+                <w:sz w:val="20"/>
                 <w:szCs w:val="19"/>
               </w:rPr>
               <w:t xml:space="preserve">200 { event }</w:t>
@@ -2932,6 +3114,9 @@
         </w:tc>
       </w:tr>
       <w:tr>
+        <w:trPr>
+          <w:cantSplit/>
+        </w:trPr>
         <w:tc>
           <w:tcPr>
             <w:tcW w:type="pct" w:w="20%"/>
@@ -2949,7 +3134,7 @@
                 <w:rFonts w:ascii="Calibri" w:cs="Calibri" w:eastAsia="Calibri" w:hAnsi="Calibri"/>
                 <w:b/>
                 <w:bCs/>
-                <w:sz w:val="19"/>
+                <w:sz w:val="20"/>
                 <w:szCs w:val="19"/>
               </w:rPr>
               <w:t xml:space="preserve">DELETE /events/:id</w:t>
@@ -2971,7 +3156,7 @@
             <w:r>
               <w:rPr>
                 <w:rFonts w:ascii="Calibri" w:cs="Calibri" w:eastAsia="Calibri" w:hAnsi="Calibri"/>
-                <w:sz w:val="19"/>
+                <w:sz w:val="20"/>
                 <w:szCs w:val="19"/>
               </w:rPr>
               <w:t xml:space="preserve">Penyelenggara pemilik (Auth)</w:t>
@@ -2993,10 +3178,10 @@
             <w:r>
               <w:rPr>
                 <w:rFonts w:ascii="Calibri" w:cs="Calibri" w:eastAsia="Calibri" w:hAnsi="Calibri"/>
-                <w:sz w:val="19"/>
-                <w:szCs w:val="19"/>
-              </w:rPr>
-              <w:t xml:space="preserve">Membatalkan/menghapus event miliknya</w:t>
+                <w:sz w:val="20"/>
+                <w:szCs w:val="19"/>
+              </w:rPr>
+              <w:t>Menghapus event milik sendiri berstatus diajukan/ditolak</w:t>
             </w:r>
           </w:p>
         </w:tc>
@@ -3018,7 +3203,7 @@
                 <w:i/>
                 <w:iCs/>
                 <w:color w:val="555555"/>
-                <w:sz w:val="19"/>
+                <w:sz w:val="20"/>
                 <w:szCs w:val="19"/>
               </w:rPr>
               <w:t xml:space="preserve">—</w:t>
@@ -3043,10 +3228,230 @@
                 <w:i/>
                 <w:iCs/>
                 <w:color w:val="555555"/>
-                <w:sz w:val="19"/>
+                <w:sz w:val="20"/>
                 <w:szCs w:val="19"/>
               </w:rPr>
               <w:t xml:space="preserve">200 { message }</w:t>
+            </w:r>
+          </w:p>
+        </w:tc>
+      </w:tr>
+      <w:tr>
+        <w:trPr>
+          <w:cantSplit/>
+        </w:trPr>
+        <w:tc>
+          <w:tcPr>
+            <w:tcW w:type="pct" w:w="20%"/>
+            <w:tcMar>
+              <w:top w:type="dxa" w:w="60"/>
+              <w:left w:type="dxa" w:w="100"/>
+              <w:bottom w:type="dxa" w:w="60"/>
+              <w:right w:type="dxa" w:w="100"/>
+            </w:tcMar>
+            <w:vAlign w:val="center"/>
+          </w:tcPr>
+          <w:p>
+            <w:r>
+              <w:rPr>
+                <w:rFonts w:ascii="Calibri" w:hAnsi="Calibri"/>
+                <w:sz w:val="20"/>
+              </w:rPr>
+              <w:t>GET /admin/events</w:t>
+            </w:r>
+          </w:p>
+        </w:tc>
+        <w:tc>
+          <w:tcPr>
+            <w:tcW w:type="pct" w:w="17%"/>
+            <w:tcMar>
+              <w:top w:type="dxa" w:w="60"/>
+              <w:left w:type="dxa" w:w="100"/>
+              <w:bottom w:type="dxa" w:w="60"/>
+              <w:right w:type="dxa" w:w="100"/>
+            </w:tcMar>
+            <w:vAlign w:val="center"/>
+          </w:tcPr>
+          <w:p>
+            <w:r>
+              <w:rPr>
+                <w:rFonts w:ascii="Calibri" w:hAnsi="Calibri"/>
+                <w:sz w:val="20"/>
+              </w:rPr>
+              <w:t>Admin (Auth)</w:t>
+            </w:r>
+          </w:p>
+        </w:tc>
+        <w:tc>
+          <w:tcPr>
+            <w:tcW w:type="pct" w:w="26%"/>
+            <w:tcMar>
+              <w:top w:type="dxa" w:w="60"/>
+              <w:left w:type="dxa" w:w="100"/>
+              <w:bottom w:type="dxa" w:w="60"/>
+              <w:right w:type="dxa" w:w="100"/>
+            </w:tcMar>
+            <w:vAlign w:val="center"/>
+          </w:tcPr>
+          <w:p>
+            <w:r>
+              <w:rPr>
+                <w:rFonts w:ascii="Calibri" w:hAnsi="Calibri"/>
+                <w:sz w:val="20"/>
+              </w:rPr>
+              <w:t>Antrean dan riwayat moderasi</w:t>
+            </w:r>
+          </w:p>
+        </w:tc>
+        <w:tc>
+          <w:tcPr>
+            <w:tcW w:type="pct" w:w="20%"/>
+            <w:tcMar>
+              <w:top w:type="dxa" w:w="60"/>
+              <w:left w:type="dxa" w:w="100"/>
+              <w:bottom w:type="dxa" w:w="60"/>
+              <w:right w:type="dxa" w:w="100"/>
+            </w:tcMar>
+            <w:vAlign w:val="center"/>
+          </w:tcPr>
+          <w:p>
+            <w:r>
+              <w:rPr>
+                <w:rFonts w:ascii="Calibri" w:hAnsi="Calibri"/>
+                <w:sz w:val="20"/>
+              </w:rPr>
+              <w:t>?status=diajukan&amp;page=1&amp;limit=20</w:t>
+            </w:r>
+          </w:p>
+        </w:tc>
+        <w:tc>
+          <w:tcPr>
+            <w:tcW w:type="pct" w:w="17%"/>
+            <w:tcMar>
+              <w:top w:type="dxa" w:w="60"/>
+              <w:left w:type="dxa" w:w="100"/>
+              <w:bottom w:type="dxa" w:w="60"/>
+              <w:right w:type="dxa" w:w="100"/>
+            </w:tcMar>
+            <w:vAlign w:val="center"/>
+          </w:tcPr>
+          <w:p>
+            <w:r>
+              <w:rPr>
+                <w:rFonts w:ascii="Calibri" w:hAnsi="Calibri"/>
+                <w:sz w:val="20"/>
+              </w:rPr>
+              <w:t>200 { data: [...], page, total }</w:t>
+            </w:r>
+          </w:p>
+        </w:tc>
+      </w:tr>
+      <w:tr>
+        <w:trPr>
+          <w:cantSplit/>
+        </w:trPr>
+        <w:tc>
+          <w:tcPr>
+            <w:tcW w:type="pct" w:w="20%"/>
+            <w:tcMar>
+              <w:top w:type="dxa" w:w="60"/>
+              <w:left w:type="dxa" w:w="100"/>
+              <w:bottom w:type="dxa" w:w="60"/>
+              <w:right w:type="dxa" w:w="100"/>
+            </w:tcMar>
+            <w:vAlign w:val="center"/>
+          </w:tcPr>
+          <w:p>
+            <w:r>
+              <w:rPr>
+                <w:rFonts w:ascii="Calibri" w:hAnsi="Calibri"/>
+                <w:sz w:val="20"/>
+              </w:rPr>
+              <w:t>PATCH /events/:id/complete</w:t>
+            </w:r>
+          </w:p>
+        </w:tc>
+        <w:tc>
+          <w:tcPr>
+            <w:tcW w:type="pct" w:w="17%"/>
+            <w:tcMar>
+              <w:top w:type="dxa" w:w="60"/>
+              <w:left w:type="dxa" w:w="100"/>
+              <w:bottom w:type="dxa" w:w="60"/>
+              <w:right w:type="dxa" w:w="100"/>
+            </w:tcMar>
+            <w:vAlign w:val="center"/>
+          </w:tcPr>
+          <w:p>
+            <w:r>
+              <w:rPr>
+                <w:rFonts w:ascii="Calibri" w:hAnsi="Calibri"/>
+                <w:sz w:val="20"/>
+              </w:rPr>
+              <w:t>Penyelenggara pemilik / Admin (Auth)</w:t>
+            </w:r>
+          </w:p>
+        </w:tc>
+        <w:tc>
+          <w:tcPr>
+            <w:tcW w:type="pct" w:w="26%"/>
+            <w:tcMar>
+              <w:top w:type="dxa" w:w="60"/>
+              <w:left w:type="dxa" w:w="100"/>
+              <w:bottom w:type="dxa" w:w="60"/>
+              <w:right w:type="dxa" w:w="100"/>
+            </w:tcMar>
+            <w:vAlign w:val="center"/>
+          </w:tcPr>
+          <w:p>
+            <w:r>
+              <w:rPr>
+                <w:rFonts w:ascii="Calibri" w:hAnsi="Calibri"/>
+                <w:sz w:val="20"/>
+              </w:rPr>
+              <w:t>Menandai event disetujui selesai setelah jadwal lewat dan pelaksanaan berakhir</w:t>
+            </w:r>
+          </w:p>
+        </w:tc>
+        <w:tc>
+          <w:tcPr>
+            <w:tcW w:type="pct" w:w="20%"/>
+            <w:tcMar>
+              <w:top w:type="dxa" w:w="60"/>
+              <w:left w:type="dxa" w:w="100"/>
+              <w:bottom w:type="dxa" w:w="60"/>
+              <w:right w:type="dxa" w:w="100"/>
+            </w:tcMar>
+            <w:vAlign w:val="center"/>
+          </w:tcPr>
+          <w:p>
+            <w:r>
+              <w:rPr>
+                <w:rFonts w:ascii="Calibri" w:hAnsi="Calibri"/>
+                <w:sz w:val="20"/>
+              </w:rPr>
+              <w:t>—</w:t>
+            </w:r>
+          </w:p>
+        </w:tc>
+        <w:tc>
+          <w:tcPr>
+            <w:tcW w:type="pct" w:w="17%"/>
+            <w:tcMar>
+              <w:top w:type="dxa" w:w="60"/>
+              <w:left w:type="dxa" w:w="100"/>
+              <w:bottom w:type="dxa" w:w="60"/>
+              <w:right w:type="dxa" w:w="100"/>
+            </w:tcMar>
+            <w:vAlign w:val="center"/>
+          </w:tcPr>
+          <w:p>
+            <w:r>
+              <w:rPr>
+                <w:rFonts w:ascii="Calibri" w:hAnsi="Calibri"/>
+                <w:sz w:val="20"/>
+              </w:rPr>
+              <w:t>200 { eventId, status: "selesai" }</w:t>
             </w:r>
           </w:p>
         </w:tc>
@@ -3054,6 +3459,8 @@
     </w:tbl>
     <w:p>
       <w:pPr>
+        <w:keepNext/>
+        <w:keepLines/>
         <w:spacing w:after="160" w:before="320"/>
       </w:pPr>
       <w:r>
@@ -3090,6 +3497,7 @@
       <w:tr>
         <w:trPr>
           <w:tblHeader/>
+          <w:cantSplit/>
         </w:trPr>
         <w:tc>
           <w:tcPr>
@@ -3223,6 +3631,9 @@
         </w:tc>
       </w:tr>
       <w:tr>
+        <w:trPr>
+          <w:cantSplit/>
+        </w:trPr>
         <w:tc>
           <w:tcPr>
             <w:tcW w:type="pct" w:w="26%"/>
@@ -3240,7 +3651,7 @@
                 <w:rFonts w:ascii="Calibri" w:cs="Calibri" w:eastAsia="Calibri" w:hAnsi="Calibri"/>
                 <w:b/>
                 <w:bCs/>
-                <w:sz w:val="19"/>
+                <w:sz w:val="20"/>
                 <w:szCs w:val="19"/>
               </w:rPr>
               <w:t xml:space="preserve">POST /events/:id/registrations</w:t>
@@ -3262,7 +3673,7 @@
             <w:r>
               <w:rPr>
                 <w:rFonts w:ascii="Calibri" w:cs="Calibri" w:eastAsia="Calibri" w:hAnsi="Calibri"/>
-                <w:sz w:val="19"/>
+                <w:sz w:val="20"/>
                 <w:szCs w:val="19"/>
               </w:rPr>
               <w:t xml:space="preserve">Mahasiswa (Auth)</w:t>
@@ -3284,10 +3695,10 @@
             <w:r>
               <w:rPr>
                 <w:rFonts w:ascii="Calibri" w:cs="Calibri" w:eastAsia="Calibri" w:hAnsi="Calibri"/>
-                <w:sz w:val="19"/>
-                <w:szCs w:val="19"/>
-              </w:rPr>
-              <w:t xml:space="preserve">Mendaftar (RSVP) ke sebuah event</w:t>
+                <w:sz w:val="20"/>
+                <w:szCs w:val="19"/>
+              </w:rPr>
+              <w:t>RSVP atau aktifkan kembali RSVP dibatalkan; reservasi kuota atomik</w:t>
             </w:r>
           </w:p>
         </w:tc>
@@ -3309,7 +3720,7 @@
                 <w:i/>
                 <w:iCs/>
                 <w:color w:val="555555"/>
-                <w:sz w:val="19"/>
+                <w:sz w:val="20"/>
                 <w:szCs w:val="19"/>
               </w:rPr>
               <w:t xml:space="preserve">— (id dari token &amp; URL)</w:t>
@@ -3334,7 +3745,7 @@
                 <w:i/>
                 <w:iCs/>
                 <w:color w:val="555555"/>
-                <w:sz w:val="19"/>
+                <w:sz w:val="20"/>
                 <w:szCs w:val="19"/>
               </w:rPr>
               <w:t xml:space="preserve">201 { registrationId, status: "aktif" }</w:t>
@@ -3343,6 +3754,9 @@
         </w:tc>
       </w:tr>
       <w:tr>
+        <w:trPr>
+          <w:cantSplit/>
+        </w:trPr>
         <w:tc>
           <w:tcPr>
             <w:tcW w:type="pct" w:w="26%"/>
@@ -3360,7 +3774,7 @@
                 <w:rFonts w:ascii="Calibri" w:cs="Calibri" w:eastAsia="Calibri" w:hAnsi="Calibri"/>
                 <w:b/>
                 <w:bCs/>
-                <w:sz w:val="19"/>
+                <w:sz w:val="20"/>
                 <w:szCs w:val="19"/>
               </w:rPr>
               <w:t xml:space="preserve">DELETE /registrations/:id</w:t>
@@ -3382,7 +3796,7 @@
             <w:r>
               <w:rPr>
                 <w:rFonts w:ascii="Calibri" w:cs="Calibri" w:eastAsia="Calibri" w:hAnsi="Calibri"/>
-                <w:sz w:val="19"/>
+                <w:sz w:val="20"/>
                 <w:szCs w:val="19"/>
               </w:rPr>
               <w:t xml:space="preserve">Mahasiswa pemilik (Auth)</w:t>
@@ -3404,7 +3818,7 @@
             <w:r>
               <w:rPr>
                 <w:rFonts w:ascii="Calibri" w:cs="Calibri" w:eastAsia="Calibri" w:hAnsi="Calibri"/>
-                <w:sz w:val="19"/>
+                <w:sz w:val="20"/>
                 <w:szCs w:val="19"/>
               </w:rPr>
               <w:t xml:space="preserve">Membatalkan pendaftaran</w:t>
@@ -3429,7 +3843,7 @@
                 <w:i/>
                 <w:iCs/>
                 <w:color w:val="555555"/>
-                <w:sz w:val="19"/>
+                <w:sz w:val="20"/>
                 <w:szCs w:val="19"/>
               </w:rPr>
               <w:t xml:space="preserve">—</w:t>
@@ -3454,7 +3868,7 @@
                 <w:i/>
                 <w:iCs/>
                 <w:color w:val="555555"/>
-                <w:sz w:val="19"/>
+                <w:sz w:val="20"/>
                 <w:szCs w:val="19"/>
               </w:rPr>
               <w:t xml:space="preserve">200 { message }</w:t>
@@ -3463,6 +3877,9 @@
         </w:tc>
       </w:tr>
       <w:tr>
+        <w:trPr>
+          <w:cantSplit/>
+        </w:trPr>
         <w:tc>
           <w:tcPr>
             <w:tcW w:type="pct" w:w="26%"/>
@@ -3480,7 +3897,7 @@
                 <w:rFonts w:ascii="Calibri" w:cs="Calibri" w:eastAsia="Calibri" w:hAnsi="Calibri"/>
                 <w:b/>
                 <w:bCs/>
-                <w:sz w:val="19"/>
+                <w:sz w:val="20"/>
                 <w:szCs w:val="19"/>
               </w:rPr>
               <w:t xml:space="preserve">GET /events/:id/registrations</w:t>
@@ -3502,7 +3919,7 @@
             <w:r>
               <w:rPr>
                 <w:rFonts w:ascii="Calibri" w:cs="Calibri" w:eastAsia="Calibri" w:hAnsi="Calibri"/>
-                <w:sz w:val="19"/>
+                <w:sz w:val="20"/>
                 <w:szCs w:val="19"/>
               </w:rPr>
               <w:t xml:space="preserve">Penyelenggara pemilik / Admin (Auth)</w:t>
@@ -3524,7 +3941,7 @@
             <w:r>
               <w:rPr>
                 <w:rFonts w:ascii="Calibri" w:cs="Calibri" w:eastAsia="Calibri" w:hAnsi="Calibri"/>
-                <w:sz w:val="19"/>
+                <w:sz w:val="20"/>
                 <w:szCs w:val="19"/>
               </w:rPr>
               <w:t xml:space="preserve">Daftar &amp; statistik peserta terdaftar</w:t>
@@ -3549,7 +3966,7 @@
                 <w:i/>
                 <w:iCs/>
                 <w:color w:val="555555"/>
-                <w:sz w:val="19"/>
+                <w:sz w:val="20"/>
                 <w:szCs w:val="19"/>
               </w:rPr>
               <w:t xml:space="preserve">?page=&amp;limit=20</w:t>
@@ -3574,15 +3991,18 @@
                 <w:i/>
                 <w:iCs/>
                 <w:color w:val="555555"/>
-                <w:sz w:val="19"/>
-                <w:szCs w:val="19"/>
-              </w:rPr>
-              <w:t xml:space="preserve">200 { data: [...], total }</w:t>
+                <w:sz w:val="20"/>
+                <w:szCs w:val="19"/>
+              </w:rPr>
+              <w:t>200 { data: [...], total, activeCount, cancelledCount }</w:t>
             </w:r>
           </w:p>
         </w:tc>
       </w:tr>
       <w:tr>
+        <w:trPr>
+          <w:cantSplit/>
+        </w:trPr>
         <w:tc>
           <w:tcPr>
             <w:tcW w:type="pct" w:w="26%"/>
@@ -3600,7 +4020,7 @@
                 <w:rFonts w:ascii="Calibri" w:cs="Calibri" w:eastAsia="Calibri" w:hAnsi="Calibri"/>
                 <w:b/>
                 <w:bCs/>
-                <w:sz w:val="19"/>
+                <w:sz w:val="20"/>
                 <w:szCs w:val="19"/>
               </w:rPr>
               <w:t xml:space="preserve">GET /events/:id/registrations/export</w:t>
@@ -3622,7 +4042,7 @@
             <w:r>
               <w:rPr>
                 <w:rFonts w:ascii="Calibri" w:cs="Calibri" w:eastAsia="Calibri" w:hAnsi="Calibri"/>
-                <w:sz w:val="19"/>
+                <w:sz w:val="20"/>
                 <w:szCs w:val="19"/>
               </w:rPr>
               <w:t xml:space="preserve">Penyelenggara pemilik (Auth)</w:t>
@@ -3644,7 +4064,7 @@
             <w:r>
               <w:rPr>
                 <w:rFonts w:ascii="Calibri" w:cs="Calibri" w:eastAsia="Calibri" w:hAnsi="Calibri"/>
-                <w:sz w:val="19"/>
+                <w:sz w:val="20"/>
                 <w:szCs w:val="19"/>
               </w:rPr>
               <w:t xml:space="preserve">Ekspor data peserta (CSV)</w:t>
@@ -3669,7 +4089,7 @@
                 <w:i/>
                 <w:iCs/>
                 <w:color w:val="555555"/>
-                <w:sz w:val="19"/>
+                <w:sz w:val="20"/>
                 <w:szCs w:val="19"/>
               </w:rPr>
               <w:t xml:space="preserve">—</w:t>
@@ -3694,10 +4114,120 @@
                 <w:i/>
                 <w:iCs/>
                 <w:color w:val="555555"/>
-                <w:sz w:val="19"/>
+                <w:sz w:val="20"/>
                 <w:szCs w:val="19"/>
               </w:rPr>
               <w:t xml:space="preserve">200 file CSV</w:t>
+            </w:r>
+          </w:p>
+        </w:tc>
+      </w:tr>
+      <w:tr>
+        <w:trPr>
+          <w:cantSplit/>
+        </w:trPr>
+        <w:tc>
+          <w:tcPr>
+            <w:tcW w:type="pct" w:w="26%"/>
+            <w:tcMar>
+              <w:top w:type="dxa" w:w="60"/>
+              <w:left w:type="dxa" w:w="100"/>
+              <w:bottom w:type="dxa" w:w="60"/>
+              <w:right w:type="dxa" w:w="100"/>
+            </w:tcMar>
+            <w:vAlign w:val="center"/>
+          </w:tcPr>
+          <w:p>
+            <w:r>
+              <w:rPr>
+                <w:rFonts w:ascii="Calibri" w:hAnsi="Calibri"/>
+                <w:sz w:val="20"/>
+              </w:rPr>
+              <w:t>GET /registrations/me</w:t>
+            </w:r>
+          </w:p>
+        </w:tc>
+        <w:tc>
+          <w:tcPr>
+            <w:tcW w:type="pct" w:w="20%"/>
+            <w:tcMar>
+              <w:top w:type="dxa" w:w="60"/>
+              <w:left w:type="dxa" w:w="100"/>
+              <w:bottom w:type="dxa" w:w="60"/>
+              <w:right w:type="dxa" w:w="100"/>
+            </w:tcMar>
+            <w:vAlign w:val="center"/>
+          </w:tcPr>
+          <w:p>
+            <w:r>
+              <w:rPr>
+                <w:rFonts w:ascii="Calibri" w:hAnsi="Calibri"/>
+                <w:sz w:val="20"/>
+              </w:rPr>
+              <w:t>Mahasiswa (Auth)</w:t>
+            </w:r>
+          </w:p>
+        </w:tc>
+        <w:tc>
+          <w:tcPr>
+            <w:tcW w:type="pct" w:w="27%"/>
+            <w:tcMar>
+              <w:top w:type="dxa" w:w="60"/>
+              <w:left w:type="dxa" w:w="100"/>
+              <w:bottom w:type="dxa" w:w="60"/>
+              <w:right w:type="dxa" w:w="100"/>
+            </w:tcMar>
+            <w:vAlign w:val="center"/>
+          </w:tcPr>
+          <w:p>
+            <w:r>
+              <w:rPr>
+                <w:rFonts w:ascii="Calibri" w:hAnsi="Calibri"/>
+                <w:sz w:val="20"/>
+              </w:rPr>
+              <w:t>Daftar RSVP milik mahasiswa login</w:t>
+            </w:r>
+          </w:p>
+        </w:tc>
+        <w:tc>
+          <w:tcPr>
+            <w:tcW w:type="pct" w:w="15%"/>
+            <w:tcMar>
+              <w:top w:type="dxa" w:w="60"/>
+              <w:left w:type="dxa" w:w="100"/>
+              <w:bottom w:type="dxa" w:w="60"/>
+              <w:right w:type="dxa" w:w="100"/>
+            </w:tcMar>
+            <w:vAlign w:val="center"/>
+          </w:tcPr>
+          <w:p>
+            <w:r>
+              <w:rPr>
+                <w:rFonts w:ascii="Calibri" w:hAnsi="Calibri"/>
+                <w:sz w:val="20"/>
+              </w:rPr>
+              <w:t>?page=1&amp;limit=20</w:t>
+            </w:r>
+          </w:p>
+        </w:tc>
+        <w:tc>
+          <w:tcPr>
+            <w:tcW w:type="pct" w:w="22%"/>
+            <w:tcMar>
+              <w:top w:type="dxa" w:w="60"/>
+              <w:left w:type="dxa" w:w="100"/>
+              <w:bottom w:type="dxa" w:w="60"/>
+              <w:right w:type="dxa" w:w="100"/>
+            </w:tcMar>
+            <w:vAlign w:val="center"/>
+          </w:tcPr>
+          <w:p>
+            <w:r>
+              <w:rPr>
+                <w:rFonts w:ascii="Calibri" w:hAnsi="Calibri"/>
+                <w:sz w:val="20"/>
+              </w:rPr>
+              <w:t>200 { data: [...], page, total }</w:t>
             </w:r>
           </w:p>
         </w:tc>
@@ -3705,6 +4235,8 @@
     </w:tbl>
     <w:p>
       <w:pPr>
+        <w:keepNext/>
+        <w:keepLines/>
         <w:spacing w:after="160" w:before="320"/>
       </w:pPr>
       <w:r>
@@ -3741,6 +4273,7 @@
       <w:tr>
         <w:trPr>
           <w:tblHeader/>
+          <w:cantSplit/>
         </w:trPr>
         <w:tc>
           <w:tcPr>
@@ -3874,6 +4407,9 @@
         </w:tc>
       </w:tr>
       <w:tr>
+        <w:trPr>
+          <w:cantSplit/>
+        </w:trPr>
         <w:tc>
           <w:tcPr>
             <w:tcW w:type="pct" w:w="24%"/>
@@ -3891,7 +4427,7 @@
                 <w:rFonts w:ascii="Calibri" w:cs="Calibri" w:eastAsia="Calibri" w:hAnsi="Calibri"/>
                 <w:b/>
                 <w:bCs/>
-                <w:sz w:val="19"/>
+                <w:sz w:val="20"/>
                 <w:szCs w:val="19"/>
               </w:rPr>
               <w:t xml:space="preserve">GET /notifications</w:t>
@@ -3913,7 +4449,7 @@
             <w:r>
               <w:rPr>
                 <w:rFonts w:ascii="Calibri" w:cs="Calibri" w:eastAsia="Calibri" w:hAnsi="Calibri"/>
-                <w:sz w:val="19"/>
+                <w:sz w:val="20"/>
                 <w:szCs w:val="19"/>
               </w:rPr>
               <w:t xml:space="preserve">Semua peran (Auth)</w:t>
@@ -3935,7 +4471,7 @@
             <w:r>
               <w:rPr>
                 <w:rFonts w:ascii="Calibri" w:cs="Calibri" w:eastAsia="Calibri" w:hAnsi="Calibri"/>
-                <w:sz w:val="19"/>
+                <w:sz w:val="20"/>
                 <w:szCs w:val="19"/>
               </w:rPr>
               <w:t xml:space="preserve">Daftar notifikasi milik pengguna login</w:t>
@@ -3960,7 +4496,7 @@
                 <w:i/>
                 <w:iCs/>
                 <w:color w:val="555555"/>
-                <w:sz w:val="19"/>
+                <w:sz w:val="20"/>
                 <w:szCs w:val="19"/>
               </w:rPr>
               <w:t xml:space="preserve">?page=&amp;limit=20</w:t>
@@ -3985,7 +4521,7 @@
                 <w:i/>
                 <w:iCs/>
                 <w:color w:val="555555"/>
-                <w:sz w:val="19"/>
+                <w:sz w:val="20"/>
                 <w:szCs w:val="19"/>
               </w:rPr>
               <w:t xml:space="preserve">200 { data: [...], unreadCount }</w:t>
@@ -3994,6 +4530,9 @@
         </w:tc>
       </w:tr>
       <w:tr>
+        <w:trPr>
+          <w:cantSplit/>
+        </w:trPr>
         <w:tc>
           <w:tcPr>
             <w:tcW w:type="pct" w:w="24%"/>
@@ -4011,7 +4550,7 @@
                 <w:rFonts w:ascii="Calibri" w:cs="Calibri" w:eastAsia="Calibri" w:hAnsi="Calibri"/>
                 <w:b/>
                 <w:bCs/>
-                <w:sz w:val="19"/>
+                <w:sz w:val="20"/>
                 <w:szCs w:val="19"/>
               </w:rPr>
               <w:t xml:space="preserve">PATCH /notifications/:id/read</w:t>
@@ -4033,7 +4572,7 @@
             <w:r>
               <w:rPr>
                 <w:rFonts w:ascii="Calibri" w:cs="Calibri" w:eastAsia="Calibri" w:hAnsi="Calibri"/>
-                <w:sz w:val="19"/>
+                <w:sz w:val="20"/>
                 <w:szCs w:val="19"/>
               </w:rPr>
               <w:t xml:space="preserve">Pemilik notifikasi (Auth)</w:t>
@@ -4055,7 +4594,7 @@
             <w:r>
               <w:rPr>
                 <w:rFonts w:ascii="Calibri" w:cs="Calibri" w:eastAsia="Calibri" w:hAnsi="Calibri"/>
-                <w:sz w:val="19"/>
+                <w:sz w:val="20"/>
                 <w:szCs w:val="19"/>
               </w:rPr>
               <w:t xml:space="preserve">Menandai satu notifikasi sudah dibaca</w:t>
@@ -4080,7 +4619,7 @@
                 <w:i/>
                 <w:iCs/>
                 <w:color w:val="555555"/>
-                <w:sz w:val="19"/>
+                <w:sz w:val="20"/>
                 <w:szCs w:val="19"/>
               </w:rPr>
               <w:t xml:space="preserve">—</w:t>
@@ -4105,7 +4644,7 @@
                 <w:i/>
                 <w:iCs/>
                 <w:color w:val="555555"/>
-                <w:sz w:val="19"/>
+                <w:sz w:val="20"/>
                 <w:szCs w:val="19"/>
               </w:rPr>
               <w:t xml:space="preserve">200 { notificationId, isRead: true }</w:t>
@@ -4114,6 +4653,9 @@
         </w:tc>
       </w:tr>
       <w:tr>
+        <w:trPr>
+          <w:cantSplit/>
+        </w:trPr>
         <w:tc>
           <w:tcPr>
             <w:tcW w:type="pct" w:w="24%"/>
@@ -4131,7 +4673,7 @@
                 <w:rFonts w:ascii="Calibri" w:cs="Calibri" w:eastAsia="Calibri" w:hAnsi="Calibri"/>
                 <w:b/>
                 <w:bCs/>
-                <w:sz w:val="19"/>
+                <w:sz w:val="20"/>
                 <w:szCs w:val="19"/>
               </w:rPr>
               <w:t xml:space="preserve">POST /notification-subscriptions</w:t>
@@ -4153,7 +4695,7 @@
             <w:r>
               <w:rPr>
                 <w:rFonts w:ascii="Calibri" w:cs="Calibri" w:eastAsia="Calibri" w:hAnsi="Calibri"/>
-                <w:sz w:val="19"/>
+                <w:sz w:val="20"/>
                 <w:szCs w:val="19"/>
               </w:rPr>
               <w:t xml:space="preserve">Mahasiswa (Auth)</w:t>
@@ -4175,10 +4717,10 @@
             <w:r>
               <w:rPr>
                 <w:rFonts w:ascii="Calibri" w:cs="Calibri" w:eastAsia="Calibri" w:hAnsi="Calibri"/>
-                <w:sz w:val="19"/>
-                <w:szCs w:val="19"/>
-              </w:rPr>
-              <w:t xml:space="preserve">Berlangganan kategori event tertentu</w:t>
+                <w:sz w:val="20"/>
+                <w:szCs w:val="19"/>
+              </w:rPr>
+              <w:t>Berlangganan kategori; ulangi langganan yang sama secara idempoten</w:t>
             </w:r>
           </w:p>
         </w:tc>
@@ -4200,7 +4742,7 @@
                 <w:i/>
                 <w:iCs/>
                 <w:color w:val="555555"/>
-                <w:sz w:val="19"/>
+                <w:sz w:val="20"/>
                 <w:szCs w:val="19"/>
               </w:rPr>
               <w:t xml:space="preserve">{ categoryId }</w:t>
@@ -4225,7 +4767,7 @@
                 <w:i/>
                 <w:iCs/>
                 <w:color w:val="555555"/>
-                <w:sz w:val="19"/>
+                <w:sz w:val="20"/>
                 <w:szCs w:val="19"/>
               </w:rPr>
               <w:t xml:space="preserve">201 { subscriptionId }</w:t>
@@ -4236,6 +4778,27 @@
     </w:tbl>
     <w:p>
       <w:pPr>
+        <w:keepNext w:val="0"/>
+        <w:keepLines w:val="0"/>
+        <w:spacing w:after="120" w:before="0"/>
+      </w:pPr>
+      <w:r>
+        <w:rPr>
+          <w:rFonts w:ascii="Calibri" w:cs="Calibri" w:eastAsia="Calibri" w:hAnsi="Calibri"/>
+          <w:b w:val="0"/>
+          <w:bCs/>
+          <w:i w:val="0"/>
+          <w:color w:val="000000"/>
+          <w:sz w:val="22"/>
+          <w:szCs w:val="25"/>
+        </w:rPr>
+        <w:t>Aturan kontrak: page harus bilangan bulat ≥ 1 dan limit 1–20. date memakai satu hari dalam zona waktu aplikasi; from/to ISO 8601 memakai batas akhir eksklusif dan tidak digabung dengan date. Identitas pengguna berasal dari JWT tervalidasi. Respons kesalahan: 401 autentikasi, 403 role/kepemilikan, 404 data tidak ada, 409 duplikasi/kuota/transisi status, dan 422 input tidak valid. Listing publik tidak dapat dibuka ke status internal melalui parameter klien.</w:t>
+      </w:r>
+    </w:p>
+    <w:p>
+      <w:pPr>
+        <w:keepNext/>
+        <w:keepLines/>
         <w:spacing w:after="160" w:before="320"/>
       </w:pPr>
       <w:r>
@@ -4253,6 +4816,7 @@
     <w:p>
       <w:pPr>
         <w:pStyle w:val="ListParagraph"/>
+        <w:keepNext/>
         <w:numPr>
           <w:ilvl w:val="0"/>
           <w:numId w:val="1"/>
@@ -4271,6 +4835,7 @@
     <w:p>
       <w:pPr>
         <w:pStyle w:val="ListParagraph"/>
+        <w:keepNext/>
         <w:numPr>
           <w:ilvl w:val="0"/>
           <w:numId w:val="1"/>
@@ -4289,6 +4854,7 @@
     <w:p>
       <w:pPr>
         <w:pStyle w:val="ListParagraph"/>
+        <w:keepNext/>
         <w:numPr>
           <w:ilvl w:val="0"/>
           <w:numId w:val="1"/>
@@ -4307,6 +4873,7 @@
     <w:p>
       <w:pPr>
         <w:pStyle w:val="ListParagraph"/>
+        <w:keepNext w:val="0"/>
         <w:numPr>
           <w:ilvl w:val="0"/>
           <w:numId w:val="1"/>
@@ -4323,6 +4890,7 @@
       </w:r>
     </w:p>
     <w:sectPr>
+      <w:type w:val="nextPage"/>
       <w:pgSz w:w="11906" w:h="16838" w:orient="portrait"/>
       <w:pgMar w:top="900" w:right="1100" w:bottom="900" w:left="1100" w:header="708" w:footer="708" w:gutter="0"/>
       <w:pgNumType/>

</xml_diff>

<commit_message>
Add clickable Lucidchart source links below diagram captions
</commit_message>
<xml_diff>
--- a/docs/architecture/minggu6_arsitektur_modular_classdiagram_erd.docx
+++ b/docs/architecture/minggu6_arsitektur_modular_classdiagram_erd.docx
@@ -933,6 +933,27 @@
         </w:rPr>
         <w:t>Gambar 1. Arsitektur Modular API EventKu (ekspor Lucidchart)</w:t>
       </w:r>
+      <w:r>
+        <w:br/>
+      </w:r>
+      <w:r>
+        <w:rPr>
+          <w:rFonts w:ascii="Times New Roman" w:hAnsi="Times New Roman"/>
+          <w:sz w:val="18"/>
+        </w:rPr>
+        <w:t xml:space="preserve">Sumber: </w:t>
+      </w:r>
+      <w:hyperlink r:id="rId22">
+        <w:r>
+          <w:rPr>
+            <w:rFonts w:ascii="Times New Roman" w:hAnsi="Times New Roman"/>
+            <w:color w:val="0563C1"/>
+            <w:sz w:val="18"/>
+            <w:u w:val="single"/>
+          </w:rPr>
+          <w:t>Dokumen diagram EventKu di Lucidchart</w:t>
+        </w:r>
+      </w:hyperlink>
     </w:p>
     <w:p>
       <w:pPr>
@@ -1071,6 +1092,27 @@
         </w:rPr>
         <w:t>Gambar 2. Class Diagram Modul Auth (ekspor Lucidchart)</w:t>
       </w:r>
+      <w:r>
+        <w:br/>
+      </w:r>
+      <w:r>
+        <w:rPr>
+          <w:rFonts w:ascii="Times New Roman" w:hAnsi="Times New Roman"/>
+          <w:sz w:val="18"/>
+        </w:rPr>
+        <w:t xml:space="preserve">Sumber: </w:t>
+      </w:r>
+      <w:hyperlink r:id="rId22">
+        <w:r>
+          <w:rPr>
+            <w:rFonts w:ascii="Times New Roman" w:hAnsi="Times New Roman"/>
+            <w:color w:val="0563C1"/>
+            <w:sz w:val="18"/>
+            <w:u w:val="single"/>
+          </w:rPr>
+          <w:t>Dokumen diagram EventKu di Lucidchart</w:t>
+        </w:r>
+      </w:hyperlink>
     </w:p>
     <w:p>
       <w:pPr>
@@ -1162,6 +1204,27 @@
         </w:rPr>
         <w:t>Gambar 3. Class Diagram Modul Event (ekspor Lucidchart)</w:t>
       </w:r>
+      <w:r>
+        <w:br/>
+      </w:r>
+      <w:r>
+        <w:rPr>
+          <w:rFonts w:ascii="Times New Roman" w:hAnsi="Times New Roman"/>
+          <w:sz w:val="18"/>
+        </w:rPr>
+        <w:t xml:space="preserve">Sumber: </w:t>
+      </w:r>
+      <w:hyperlink r:id="rId22">
+        <w:r>
+          <w:rPr>
+            <w:rFonts w:ascii="Times New Roman" w:hAnsi="Times New Roman"/>
+            <w:color w:val="0563C1"/>
+            <w:sz w:val="18"/>
+            <w:u w:val="single"/>
+          </w:rPr>
+          <w:t>Dokumen diagram EventKu di Lucidchart</w:t>
+        </w:r>
+      </w:hyperlink>
     </w:p>
     <w:p>
       <w:pPr>
@@ -1260,6 +1323,27 @@
         </w:rPr>
         <w:t>Gambar 4. Class Diagram Modul Pendaftaran dan RSVP (ekspor Lucidchart)</w:t>
       </w:r>
+      <w:r>
+        <w:br/>
+      </w:r>
+      <w:r>
+        <w:rPr>
+          <w:rFonts w:ascii="Times New Roman" w:hAnsi="Times New Roman"/>
+          <w:sz w:val="18"/>
+        </w:rPr>
+        <w:t xml:space="preserve">Sumber: </w:t>
+      </w:r>
+      <w:hyperlink r:id="rId22">
+        <w:r>
+          <w:rPr>
+            <w:rFonts w:ascii="Times New Roman" w:hAnsi="Times New Roman"/>
+            <w:color w:val="0563C1"/>
+            <w:sz w:val="18"/>
+            <w:u w:val="single"/>
+          </w:rPr>
+          <w:t>Dokumen diagram EventKu di Lucidchart</w:t>
+        </w:r>
+      </w:hyperlink>
     </w:p>
     <w:p>
       <w:pPr>
@@ -1358,6 +1442,27 @@
         </w:rPr>
         <w:t>Gambar 5. Class Diagram Modul Notifikasi (ekspor Lucidchart)</w:t>
       </w:r>
+      <w:r>
+        <w:br/>
+      </w:r>
+      <w:r>
+        <w:rPr>
+          <w:rFonts w:ascii="Times New Roman" w:hAnsi="Times New Roman"/>
+          <w:sz w:val="18"/>
+        </w:rPr>
+        <w:t xml:space="preserve">Sumber: </w:t>
+      </w:r>
+      <w:hyperlink r:id="rId22">
+        <w:r>
+          <w:rPr>
+            <w:rFonts w:ascii="Times New Roman" w:hAnsi="Times New Roman"/>
+            <w:color w:val="0563C1"/>
+            <w:sz w:val="18"/>
+            <w:u w:val="single"/>
+          </w:rPr>
+          <w:t>Dokumen diagram EventKu di Lucidchart</w:t>
+        </w:r>
+      </w:hyperlink>
     </w:p>
     <w:p>
       <w:pPr>
@@ -1540,6 +1645,27 @@
         </w:rPr>
         <w:t>Gambar 6. ERD Final EventKu (ekspor Lucidchart)</w:t>
       </w:r>
+      <w:r>
+        <w:br/>
+      </w:r>
+      <w:r>
+        <w:rPr>
+          <w:rFonts w:ascii="Times New Roman" w:hAnsi="Times New Roman"/>
+          <w:sz w:val="18"/>
+        </w:rPr>
+        <w:t xml:space="preserve">Sumber: </w:t>
+      </w:r>
+      <w:hyperlink r:id="rId22">
+        <w:r>
+          <w:rPr>
+            <w:rFonts w:ascii="Times New Roman" w:hAnsi="Times New Roman"/>
+            <w:color w:val="0563C1"/>
+            <w:sz w:val="18"/>
+            <w:u w:val="single"/>
+          </w:rPr>
+          <w:t>Dokumen diagram EventKu di Lucidchart</w:t>
+        </w:r>
+      </w:hyperlink>
     </w:p>
     <w:p>
       <w:pPr>
@@ -1632,6 +1758,27 @@
         </w:rPr>
         <w:t>Gambar 7. Algoritma Pencarian dan Filter Event (ekspor Lucidchart)</w:t>
       </w:r>
+      <w:r>
+        <w:br/>
+      </w:r>
+      <w:r>
+        <w:rPr>
+          <w:rFonts w:ascii="Times New Roman" w:hAnsi="Times New Roman"/>
+          <w:sz w:val="18"/>
+        </w:rPr>
+        <w:t xml:space="preserve">Sumber: </w:t>
+      </w:r>
+      <w:hyperlink r:id="rId22">
+        <w:r>
+          <w:rPr>
+            <w:rFonts w:ascii="Times New Roman" w:hAnsi="Times New Roman"/>
+            <w:color w:val="0563C1"/>
+            <w:sz w:val="18"/>
+            <w:u w:val="single"/>
+          </w:rPr>
+          <w:t>Dokumen diagram EventKu di Lucidchart</w:t>
+        </w:r>
+      </w:hyperlink>
     </w:p>
     <w:p>
       <w:pPr>
@@ -6434,12 +6581,22 @@
       </w:pPr>
       <w:r>
         <w:rPr>
-          <w:rFonts w:ascii="Calibri" w:hAnsi="Calibri"/>
-          <w:b w:val="0"/>
+          <w:rFonts w:ascii="Times New Roman" w:hAnsi="Times New Roman"/>
           <w:sz w:val="20"/>
         </w:rPr>
-        <w:t>Sumber rancangan: EventKu_2_SRS.docx versi 2. Diagram revisi tersedia di https://lucid.app/lucidchart/c1ed1ac4-eabd-423c-a2b8-d558d07f165d/edit</w:t>
-      </w:r>
+        <w:t xml:space="preserve">Sumber rancangan: EventKu_2_SRS.docx versi 2. Diagram revisi tersedia di </w:t>
+      </w:r>
+      <w:hyperlink r:id="rId22">
+        <w:r>
+          <w:rPr>
+            <w:rFonts w:ascii="Times New Roman" w:hAnsi="Times New Roman"/>
+            <w:color w:val="0563C1"/>
+            <w:sz w:val="18"/>
+            <w:u w:val="single"/>
+          </w:rPr>
+          <w:t>Dokumen diagram EventKu di Lucidchart</w:t>
+        </w:r>
+      </w:hyperlink>
     </w:p>
     <w:p>
       <w:pPr>

</xml_diff>